<commit_message>
fix: mock data is uptade
</commit_message>
<xml_diff>
--- a/documentation/Project Definition Document.docx
+++ b/documentation/Project Definition Document.docx
@@ -18,7 +18,7 @@
     </w:p>
     <w:p>
       <w:pPr>
-        <w:pStyle w:val="Balk2"/>
+        <w:pStyle w:val="Heading2"/>
         <w:rPr>
           <w:rFonts w:ascii="Times New Roman" w:eastAsia="Times New Roman" w:hAnsi="Times New Roman" w:cs="Times New Roman"/>
         </w:rPr>
@@ -339,7 +339,7 @@
     </w:p>
     <w:p>
       <w:pPr>
-        <w:pStyle w:val="Altyaz"/>
+        <w:pStyle w:val="Subtitle"/>
         <w:jc w:val="center"/>
         <w:rPr>
           <w:rFonts w:ascii="Times New Roman" w:eastAsia="Times New Roman" w:hAnsi="Times New Roman" w:cs="Times New Roman"/>
@@ -363,7 +363,7 @@
     </w:p>
     <w:p>
       <w:pPr>
-        <w:pStyle w:val="Balk2"/>
+        <w:pStyle w:val="Heading2"/>
         <w:keepNext w:val="0"/>
         <w:keepLines w:val="0"/>
         <w:spacing w:before="0"/>
@@ -374,7 +374,7 @@
     </w:p>
     <w:p>
       <w:pPr>
-        <w:pStyle w:val="Balk2"/>
+        <w:pStyle w:val="Heading2"/>
         <w:spacing w:before="0"/>
         <w:rPr>
           <w:rFonts w:ascii="Times New Roman" w:eastAsia="Times New Roman" w:hAnsi="Times New Roman" w:cs="Times New Roman"/>
@@ -382,7 +382,7 @@
       </w:pPr>
       <w:r>
         <w:rPr>
-          <w:rStyle w:val="Gl"/>
+          <w:rStyle w:val="Strong"/>
           <w:rFonts w:ascii="Times New Roman" w:eastAsia="Times New Roman" w:hAnsi="Times New Roman" w:cs="Times New Roman"/>
           <w:color w:val="3465A4"/>
           <w:sz w:val="52"/>
@@ -394,7 +394,7 @@
     </w:p>
     <w:p>
       <w:pPr>
-        <w:pStyle w:val="GvdeMetni"/>
+        <w:pStyle w:val="BodyText"/>
         <w:spacing w:after="120"/>
         <w:rPr>
           <w:rFonts w:ascii="Times New Roman" w:eastAsia="Times New Roman" w:hAnsi="Times New Roman" w:cs="Times New Roman"/>
@@ -402,14 +402,14 @@
       </w:pPr>
       <w:r>
         <w:rPr>
-          <w:rStyle w:val="Gl"/>
+          <w:rStyle w:val="Strong"/>
           <w:rFonts w:ascii="Times New Roman" w:eastAsia="Times New Roman" w:hAnsi="Times New Roman" w:cs="Times New Roman"/>
         </w:rPr>
         <w:t>1</w:t>
       </w:r>
       <w:r>
         <w:rPr>
-          <w:rStyle w:val="Gl"/>
+          <w:rStyle w:val="Strong"/>
           <w:rFonts w:ascii="Times New Roman" w:eastAsia="Times New Roman" w:hAnsi="Times New Roman" w:cs="Times New Roman"/>
           <w:b w:val="0"/>
           <w:bCs w:val="0"/>
@@ -418,14 +418,14 @@
       </w:r>
       <w:r>
         <w:rPr>
-          <w:rStyle w:val="Gl"/>
+          <w:rStyle w:val="Strong"/>
           <w:rFonts w:ascii="Times New Roman" w:eastAsia="Times New Roman" w:hAnsi="Times New Roman" w:cs="Times New Roman"/>
         </w:rPr>
         <w:t>Project Tit</w:t>
       </w:r>
       <w:r>
         <w:rPr>
-          <w:rStyle w:val="Gl"/>
+          <w:rStyle w:val="Strong"/>
           <w:rFonts w:ascii="Times New Roman" w:eastAsia="Times New Roman" w:hAnsi="Times New Roman" w:cs="Times New Roman"/>
         </w:rPr>
         <w:t>le</w:t>
@@ -433,7 +433,7 @@
     </w:p>
     <w:p>
       <w:pPr>
-        <w:pStyle w:val="GvdeMetni"/>
+        <w:pStyle w:val="BodyText"/>
         <w:spacing w:after="120"/>
         <w:rPr>
           <w:rFonts w:ascii="Times New Roman" w:eastAsia="Times New Roman" w:hAnsi="Times New Roman" w:cs="Times New Roman"/>
@@ -443,7 +443,7 @@
       </w:pPr>
       <w:r>
         <w:rPr>
-          <w:rStyle w:val="Gl"/>
+          <w:rStyle w:val="Strong"/>
           <w:rFonts w:ascii="Times New Roman" w:eastAsia="Times New Roman" w:hAnsi="Times New Roman" w:cs="Times New Roman"/>
         </w:rPr>
         <w:t>2.Problem Definition &amp; Objectives</w:t>
@@ -465,7 +465,7 @@
     </w:p>
     <w:p>
       <w:pPr>
-        <w:pStyle w:val="GvdeMetni"/>
+        <w:pStyle w:val="BodyText"/>
         <w:spacing w:after="120"/>
         <w:rPr>
           <w:rFonts w:ascii="Times New Roman" w:eastAsia="Times New Roman" w:hAnsi="Times New Roman" w:cs="Times New Roman"/>
@@ -475,7 +475,7 @@
       </w:pPr>
       <w:r>
         <w:rPr>
-          <w:rStyle w:val="Gl"/>
+          <w:rStyle w:val="Strong"/>
           <w:rFonts w:ascii="Times New Roman" w:eastAsia="Times New Roman" w:hAnsi="Times New Roman" w:cs="Times New Roman"/>
         </w:rPr>
         <w:t>3.Scope</w:t>
@@ -497,7 +497,7 @@
     </w:p>
     <w:p>
       <w:pPr>
-        <w:pStyle w:val="GvdeMetni"/>
+        <w:pStyle w:val="BodyText"/>
         <w:spacing w:after="120"/>
         <w:rPr>
           <w:rFonts w:ascii="Times New Roman" w:eastAsia="Times New Roman" w:hAnsi="Times New Roman" w:cs="Times New Roman"/>
@@ -507,7 +507,7 @@
       </w:pPr>
       <w:r>
         <w:rPr>
-          <w:rStyle w:val="Gl"/>
+          <w:rStyle w:val="Strong"/>
           <w:rFonts w:ascii="Times New Roman" w:eastAsia="Times New Roman" w:hAnsi="Times New Roman" w:cs="Times New Roman"/>
         </w:rPr>
         <w:t>4.User Profile</w:t>
@@ -522,7 +522,7 @@
     </w:p>
     <w:p>
       <w:pPr>
-        <w:pStyle w:val="GvdeMetni"/>
+        <w:pStyle w:val="BodyText"/>
         <w:spacing w:after="120"/>
         <w:rPr>
           <w:rFonts w:ascii="Times New Roman" w:eastAsia="Times New Roman" w:hAnsi="Times New Roman" w:cs="Times New Roman"/>
@@ -532,7 +532,7 @@
       </w:pPr>
       <w:r>
         <w:rPr>
-          <w:rStyle w:val="Gl"/>
+          <w:rStyle w:val="Strong"/>
           <w:rFonts w:ascii="Times New Roman" w:eastAsia="Times New Roman" w:hAnsi="Times New Roman" w:cs="Times New Roman"/>
         </w:rPr>
         <w:t>5.Anticipated Challenges &amp; Constraints</w:t>
@@ -585,7 +585,7 @@
     </w:p>
     <w:p>
       <w:pPr>
-        <w:pStyle w:val="GvdeMetni"/>
+        <w:pStyle w:val="BodyText"/>
         <w:spacing w:after="120"/>
         <w:rPr>
           <w:rFonts w:ascii="Times New Roman" w:eastAsia="Times New Roman" w:hAnsi="Times New Roman" w:cs="Times New Roman"/>
@@ -595,7 +595,7 @@
       </w:pPr>
       <w:r>
         <w:rPr>
-          <w:rStyle w:val="Gl"/>
+          <w:rStyle w:val="Strong"/>
           <w:rFonts w:ascii="Times New Roman" w:eastAsia="Times New Roman" w:hAnsi="Times New Roman" w:cs="Times New Roman"/>
         </w:rPr>
         <w:t>6.Anticipated Impacts</w:t>
@@ -645,7 +645,7 @@
     </w:p>
     <w:p>
       <w:pPr>
-        <w:pStyle w:val="GvdeMetni"/>
+        <w:pStyle w:val="BodyText"/>
         <w:spacing w:after="120"/>
         <w:rPr>
           <w:rFonts w:ascii="Times New Roman" w:eastAsia="Times New Roman" w:hAnsi="Times New Roman" w:cs="Times New Roman"/>
@@ -655,7 +655,7 @@
       </w:pPr>
       <w:r>
         <w:rPr>
-          <w:rStyle w:val="Gl"/>
+          <w:rStyle w:val="Strong"/>
           <w:rFonts w:ascii="Times New Roman" w:eastAsia="Times New Roman" w:hAnsi="Times New Roman" w:cs="Times New Roman"/>
         </w:rPr>
         <w:t>7.Data Sources</w:t>
@@ -677,7 +677,7 @@
     </w:p>
     <w:p>
       <w:pPr>
-        <w:pStyle w:val="GvdeMetni"/>
+        <w:pStyle w:val="BodyText"/>
         <w:spacing w:after="120"/>
         <w:rPr>
           <w:rFonts w:ascii="Times New Roman" w:eastAsia="Times New Roman" w:hAnsi="Times New Roman" w:cs="Times New Roman"/>
@@ -687,7 +687,7 @@
       </w:pPr>
       <w:r>
         <w:rPr>
-          <w:rStyle w:val="Gl"/>
+          <w:rStyle w:val="Strong"/>
           <w:rFonts w:ascii="Times New Roman" w:eastAsia="Times New Roman" w:hAnsi="Times New Roman" w:cs="Times New Roman"/>
         </w:rPr>
         <w:t>8.Key Features</w:t>
@@ -730,7 +730,7 @@
     </w:p>
     <w:p>
       <w:pPr>
-        <w:pStyle w:val="GvdeMetni"/>
+        <w:pStyle w:val="BodyText"/>
         <w:spacing w:after="120"/>
         <w:rPr>
           <w:rFonts w:ascii="Times New Roman" w:eastAsia="Times New Roman" w:hAnsi="Times New Roman" w:cs="Times New Roman"/>
@@ -740,7 +740,7 @@
       </w:pPr>
       <w:r>
         <w:rPr>
-          <w:rStyle w:val="Gl"/>
+          <w:rStyle w:val="Strong"/>
           <w:rFonts w:ascii="Times New Roman" w:eastAsia="Times New Roman" w:hAnsi="Times New Roman" w:cs="Times New Roman"/>
         </w:rPr>
         <w:t>9.Budget and Resources</w:t>
@@ -762,7 +762,7 @@
     </w:p>
     <w:p>
       <w:pPr>
-        <w:pStyle w:val="GvdeMetni"/>
+        <w:pStyle w:val="BodyText"/>
         <w:spacing w:after="120"/>
         <w:rPr>
           <w:rFonts w:ascii="Times New Roman" w:eastAsia="Times New Roman" w:hAnsi="Times New Roman" w:cs="Times New Roman"/>
@@ -772,7 +772,7 @@
       </w:pPr>
       <w:r>
         <w:rPr>
-          <w:rStyle w:val="Gl"/>
+          <w:rStyle w:val="Strong"/>
           <w:rFonts w:ascii="Times New Roman" w:eastAsia="Times New Roman" w:hAnsi="Times New Roman" w:cs="Times New Roman"/>
         </w:rPr>
         <w:t>10.Project Success Criteria</w:t>
@@ -780,7 +780,7 @@
     </w:p>
     <w:p>
       <w:pPr>
-        <w:pStyle w:val="GvdeMetni"/>
+        <w:pStyle w:val="BodyText"/>
         <w:spacing w:after="120"/>
         <w:rPr>
           <w:rFonts w:ascii="Times New Roman" w:eastAsia="Times New Roman" w:hAnsi="Times New Roman" w:cs="Times New Roman"/>
@@ -790,7 +790,7 @@
       </w:pPr>
       <w:r>
         <w:rPr>
-          <w:rStyle w:val="Gl"/>
+          <w:rStyle w:val="Strong"/>
           <w:rFonts w:ascii="Times New Roman" w:eastAsia="Times New Roman" w:hAnsi="Times New Roman" w:cs="Times New Roman"/>
         </w:rPr>
         <w:t>11.Task Matrix</w:t>
@@ -798,7 +798,7 @@
     </w:p>
     <w:p>
       <w:pPr>
-        <w:pStyle w:val="Balk3"/>
+        <w:pStyle w:val="Heading3"/>
         <w:spacing w:before="240" w:after="240"/>
         <w:rPr>
           <w:rFonts w:ascii="Times New Roman" w:hAnsi="Times New Roman" w:cs="Times New Roman"/>
@@ -877,7 +877,7 @@
     </w:p>
     <w:p>
       <w:pPr>
-        <w:pStyle w:val="Balk3"/>
+        <w:pStyle w:val="Heading3"/>
         <w:spacing w:before="240" w:after="240"/>
         <w:ind w:right="600"/>
         <w:rPr>
@@ -888,7 +888,7 @@
       </w:pPr>
       <w:r>
         <w:rPr>
-          <w:rStyle w:val="Gl"/>
+          <w:rStyle w:val="Strong"/>
           <w:rFonts w:ascii="Times New Roman" w:eastAsia="Times New Roman" w:hAnsi="Times New Roman" w:cs="Times New Roman"/>
           <w:color w:val="3465A4"/>
           <w:sz w:val="40"/>
@@ -900,7 +900,7 @@
       <w:proofErr w:type="spellStart"/>
       <w:r>
         <w:rPr>
-          <w:rStyle w:val="Gl"/>
+          <w:rStyle w:val="Strong"/>
           <w:rFonts w:ascii="Times New Roman" w:eastAsia="Times New Roman" w:hAnsi="Times New Roman" w:cs="Times New Roman"/>
           <w:color w:val="3465A4"/>
           <w:sz w:val="40"/>
@@ -913,7 +913,7 @@
     </w:p>
     <w:p>
       <w:pPr>
-        <w:pStyle w:val="GvdeMetni"/>
+        <w:pStyle w:val="BodyText"/>
         <w:spacing w:before="240" w:after="240"/>
         <w:rPr>
           <w:rFonts w:ascii="Times New Roman" w:eastAsia="Times New Roman" w:hAnsi="Times New Roman" w:cs="Times New Roman"/>
@@ -923,7 +923,7 @@
       </w:pPr>
       <w:r>
         <w:rPr>
-          <w:rStyle w:val="Gl"/>
+          <w:rStyle w:val="Strong"/>
           <w:rFonts w:ascii="Times New Roman" w:eastAsia="Times New Roman" w:hAnsi="Times New Roman" w:cs="Times New Roman"/>
           <w:color w:val="5983B0"/>
           <w:sz w:val="30"/>
@@ -936,7 +936,7 @@
     </w:p>
     <w:p>
       <w:pPr>
-        <w:pStyle w:val="GvdeMetni"/>
+        <w:pStyle w:val="BodyText"/>
         <w:spacing w:before="240" w:after="240"/>
         <w:rPr>
           <w:rFonts w:ascii="Times New Roman" w:eastAsia="Times New Roman" w:hAnsi="Times New Roman" w:cs="Times New Roman"/>
@@ -954,29 +954,7 @@
           <w:szCs w:val="24"/>
           <w:lang w:val="tr-TR"/>
         </w:rPr>
-        <w:t xml:space="preserve">  </w:t>
-      </w:r>
-      <w:proofErr w:type="spellStart"/>
-      <w:r>
-        <w:rPr>
-          <w:rFonts w:ascii="Times New Roman" w:eastAsia="Times New Roman" w:hAnsi="Times New Roman" w:cs="Times New Roman"/>
-          <w:bCs/>
-          <w:sz w:val="24"/>
-          <w:szCs w:val="24"/>
-          <w:lang w:val="tr-TR"/>
-        </w:rPr>
-        <w:t>The</w:t>
-      </w:r>
-      <w:proofErr w:type="spellEnd"/>
-      <w:r>
-        <w:rPr>
-          <w:rFonts w:ascii="Times New Roman" w:eastAsia="Times New Roman" w:hAnsi="Times New Roman" w:cs="Times New Roman"/>
-          <w:bCs/>
-          <w:sz w:val="24"/>
-          <w:szCs w:val="24"/>
-          <w:lang w:val="tr-TR"/>
-        </w:rPr>
-        <w:t xml:space="preserve"> </w:t>
+        <w:t xml:space="preserve">  The </w:t>
       </w:r>
       <w:proofErr w:type="spellStart"/>
       <w:r>
@@ -1548,29 +1526,7 @@
           <w:szCs w:val="24"/>
           <w:lang w:val="tr-TR"/>
         </w:rPr>
-        <w:t xml:space="preserve"> (on </w:t>
-      </w:r>
-      <w:proofErr w:type="spellStart"/>
-      <w:r>
-        <w:rPr>
-          <w:rFonts w:ascii="Times New Roman" w:eastAsia="Times New Roman" w:hAnsi="Times New Roman" w:cs="Times New Roman"/>
-          <w:bCs/>
-          <w:sz w:val="24"/>
-          <w:szCs w:val="24"/>
-          <w:lang w:val="tr-TR"/>
-        </w:rPr>
-        <w:t>the</w:t>
-      </w:r>
-      <w:proofErr w:type="spellEnd"/>
-      <w:r>
-        <w:rPr>
-          <w:rFonts w:ascii="Times New Roman" w:eastAsia="Times New Roman" w:hAnsi="Times New Roman" w:cs="Times New Roman"/>
-          <w:bCs/>
-          <w:sz w:val="24"/>
-          <w:szCs w:val="24"/>
-          <w:lang w:val="tr-TR"/>
-        </w:rPr>
-        <w:t xml:space="preserve"> </w:t>
+        <w:t xml:space="preserve"> (on the </w:t>
       </w:r>
       <w:proofErr w:type="spellStart"/>
       <w:r>
@@ -1900,29 +1856,7 @@
           <w:szCs w:val="24"/>
           <w:lang w:val="tr-TR"/>
         </w:rPr>
-        <w:t xml:space="preserve"> </w:t>
-      </w:r>
-      <w:proofErr w:type="spellStart"/>
-      <w:r>
-        <w:rPr>
-          <w:rFonts w:ascii="Times New Roman" w:eastAsia="Times New Roman" w:hAnsi="Times New Roman" w:cs="Times New Roman"/>
-          <w:bCs/>
-          <w:sz w:val="24"/>
-          <w:szCs w:val="24"/>
-          <w:lang w:val="tr-TR"/>
-        </w:rPr>
-        <w:t>the</w:t>
-      </w:r>
-      <w:proofErr w:type="spellEnd"/>
-      <w:r>
-        <w:rPr>
-          <w:rFonts w:ascii="Times New Roman" w:eastAsia="Times New Roman" w:hAnsi="Times New Roman" w:cs="Times New Roman"/>
-          <w:bCs/>
-          <w:sz w:val="24"/>
-          <w:szCs w:val="24"/>
-          <w:lang w:val="tr-TR"/>
-        </w:rPr>
-        <w:t xml:space="preserve"> </w:t>
+        <w:t xml:space="preserve"> the </w:t>
       </w:r>
       <w:proofErr w:type="spellStart"/>
       <w:r>
@@ -2010,29 +1944,7 @@
           <w:szCs w:val="24"/>
           <w:lang w:val="tr-TR"/>
         </w:rPr>
-        <w:t xml:space="preserve"> </w:t>
-      </w:r>
-      <w:proofErr w:type="spellStart"/>
-      <w:r>
-        <w:rPr>
-          <w:rFonts w:ascii="Times New Roman" w:eastAsia="Times New Roman" w:hAnsi="Times New Roman" w:cs="Times New Roman"/>
-          <w:bCs/>
-          <w:sz w:val="24"/>
-          <w:szCs w:val="24"/>
-          <w:lang w:val="tr-TR"/>
-        </w:rPr>
-        <w:t>the</w:t>
-      </w:r>
-      <w:proofErr w:type="spellEnd"/>
-      <w:r>
-        <w:rPr>
-          <w:rFonts w:ascii="Times New Roman" w:eastAsia="Times New Roman" w:hAnsi="Times New Roman" w:cs="Times New Roman"/>
-          <w:bCs/>
-          <w:sz w:val="24"/>
-          <w:szCs w:val="24"/>
-          <w:lang w:val="tr-TR"/>
-        </w:rPr>
-        <w:t xml:space="preserve"> </w:t>
+        <w:t xml:space="preserve"> the </w:t>
       </w:r>
       <w:proofErr w:type="spellStart"/>
       <w:r>
@@ -2076,29 +1988,7 @@
           <w:szCs w:val="24"/>
           <w:lang w:val="tr-TR"/>
         </w:rPr>
-        <w:t xml:space="preserve"> of </w:t>
-      </w:r>
-      <w:proofErr w:type="spellStart"/>
-      <w:r>
-        <w:rPr>
-          <w:rFonts w:ascii="Times New Roman" w:eastAsia="Times New Roman" w:hAnsi="Times New Roman" w:cs="Times New Roman"/>
-          <w:bCs/>
-          <w:sz w:val="24"/>
-          <w:szCs w:val="24"/>
-          <w:lang w:val="tr-TR"/>
-        </w:rPr>
-        <w:t>the</w:t>
-      </w:r>
-      <w:proofErr w:type="spellEnd"/>
-      <w:r>
-        <w:rPr>
-          <w:rFonts w:ascii="Times New Roman" w:eastAsia="Times New Roman" w:hAnsi="Times New Roman" w:cs="Times New Roman"/>
-          <w:bCs/>
-          <w:sz w:val="24"/>
-          <w:szCs w:val="24"/>
-          <w:lang w:val="tr-TR"/>
-        </w:rPr>
-        <w:t xml:space="preserve"> </w:t>
+        <w:t xml:space="preserve"> of the </w:t>
       </w:r>
       <w:proofErr w:type="spellStart"/>
       <w:r>
@@ -2389,7 +2279,7 @@
     </w:p>
     <w:p>
       <w:pPr>
-        <w:pStyle w:val="GvdeMetni"/>
+        <w:pStyle w:val="BodyText"/>
         <w:spacing w:before="240" w:after="240"/>
         <w:rPr>
           <w:rFonts w:ascii="Times New Roman" w:eastAsia="Times New Roman" w:hAnsi="Times New Roman" w:cs="Times New Roman"/>
@@ -2399,7 +2289,7 @@
       </w:pPr>
       <w:r>
         <w:rPr>
-          <w:rStyle w:val="Gl"/>
+          <w:rStyle w:val="Strong"/>
           <w:rFonts w:ascii="Times New Roman" w:eastAsia="Times New Roman" w:hAnsi="Times New Roman" w:cs="Times New Roman"/>
           <w:color w:val="5983B0"/>
           <w:sz w:val="30"/>
@@ -2412,7 +2302,7 @@
       <w:proofErr w:type="spellStart"/>
       <w:r>
         <w:rPr>
-          <w:rStyle w:val="Gl"/>
+          <w:rStyle w:val="Strong"/>
           <w:rFonts w:ascii="Times New Roman" w:eastAsia="Times New Roman" w:hAnsi="Times New Roman" w:cs="Times New Roman"/>
           <w:color w:val="5983B0"/>
           <w:sz w:val="30"/>
@@ -2426,7 +2316,7 @@
     </w:p>
     <w:p>
       <w:pPr>
-        <w:pStyle w:val="GvdeMetni"/>
+        <w:pStyle w:val="BodyText"/>
         <w:numPr>
           <w:ilvl w:val="0"/>
           <w:numId w:val="2"/>
@@ -2508,29 +2398,7 @@
           <w:szCs w:val="24"/>
           <w:lang w:val="tr-TR"/>
         </w:rPr>
-        <w:t xml:space="preserve"> </w:t>
-      </w:r>
-      <w:proofErr w:type="spellStart"/>
-      <w:r>
-        <w:rPr>
-          <w:rFonts w:ascii="Times New Roman" w:eastAsia="Times New Roman" w:hAnsi="Times New Roman" w:cs="Times New Roman"/>
-          <w:bCs/>
-          <w:sz w:val="24"/>
-          <w:szCs w:val="24"/>
-          <w:lang w:val="tr-TR"/>
-        </w:rPr>
-        <w:t>the</w:t>
-      </w:r>
-      <w:proofErr w:type="spellEnd"/>
-      <w:r>
-        <w:rPr>
-          <w:rFonts w:ascii="Times New Roman" w:eastAsia="Times New Roman" w:hAnsi="Times New Roman" w:cs="Times New Roman"/>
-          <w:bCs/>
-          <w:sz w:val="24"/>
-          <w:szCs w:val="24"/>
-          <w:lang w:val="tr-TR"/>
-        </w:rPr>
-        <w:t xml:space="preserve"> </w:t>
+        <w:t xml:space="preserve"> the </w:t>
       </w:r>
       <w:proofErr w:type="spellStart"/>
       <w:r>
@@ -2552,29 +2420,7 @@
           <w:szCs w:val="24"/>
           <w:lang w:val="tr-TR"/>
         </w:rPr>
-        <w:t xml:space="preserve"> of </w:t>
-      </w:r>
-      <w:proofErr w:type="spellStart"/>
-      <w:r>
-        <w:rPr>
-          <w:rFonts w:ascii="Times New Roman" w:eastAsia="Times New Roman" w:hAnsi="Times New Roman" w:cs="Times New Roman"/>
-          <w:bCs/>
-          <w:sz w:val="24"/>
-          <w:szCs w:val="24"/>
-          <w:lang w:val="tr-TR"/>
-        </w:rPr>
-        <w:t>the</w:t>
-      </w:r>
-      <w:proofErr w:type="spellEnd"/>
-      <w:r>
-        <w:rPr>
-          <w:rFonts w:ascii="Times New Roman" w:eastAsia="Times New Roman" w:hAnsi="Times New Roman" w:cs="Times New Roman"/>
-          <w:bCs/>
-          <w:sz w:val="24"/>
-          <w:szCs w:val="24"/>
-          <w:lang w:val="tr-TR"/>
-        </w:rPr>
-        <w:t xml:space="preserve"> </w:t>
+        <w:t xml:space="preserve"> of the </w:t>
       </w:r>
       <w:proofErr w:type="spellStart"/>
       <w:r>
@@ -2640,29 +2486,7 @@
           <w:szCs w:val="24"/>
           <w:lang w:val="tr-TR"/>
         </w:rPr>
-        <w:t xml:space="preserve"> in </w:t>
-      </w:r>
-      <w:proofErr w:type="spellStart"/>
-      <w:r>
-        <w:rPr>
-          <w:rFonts w:ascii="Times New Roman" w:eastAsia="Times New Roman" w:hAnsi="Times New Roman" w:cs="Times New Roman"/>
-          <w:bCs/>
-          <w:sz w:val="24"/>
-          <w:szCs w:val="24"/>
-          <w:lang w:val="tr-TR"/>
-        </w:rPr>
-        <w:t>the</w:t>
-      </w:r>
-      <w:proofErr w:type="spellEnd"/>
-      <w:r>
-        <w:rPr>
-          <w:rFonts w:ascii="Times New Roman" w:eastAsia="Times New Roman" w:hAnsi="Times New Roman" w:cs="Times New Roman"/>
-          <w:bCs/>
-          <w:sz w:val="24"/>
-          <w:szCs w:val="24"/>
-          <w:lang w:val="tr-TR"/>
-        </w:rPr>
-        <w:t xml:space="preserve"> </w:t>
+        <w:t xml:space="preserve"> in the </w:t>
       </w:r>
       <w:proofErr w:type="spellStart"/>
       <w:r>
@@ -2689,7 +2513,7 @@
     </w:p>
     <w:p>
       <w:pPr>
-        <w:pStyle w:val="GvdeMetni"/>
+        <w:pStyle w:val="BodyText"/>
         <w:numPr>
           <w:ilvl w:val="0"/>
           <w:numId w:val="2"/>
@@ -2793,29 +2617,7 @@
           <w:szCs w:val="24"/>
           <w:lang w:val="tr-TR"/>
         </w:rPr>
-        <w:t xml:space="preserve"> </w:t>
-      </w:r>
-      <w:proofErr w:type="spellStart"/>
-      <w:r>
-        <w:rPr>
-          <w:rFonts w:ascii="Times New Roman" w:eastAsia="Times New Roman" w:hAnsi="Times New Roman" w:cs="Times New Roman"/>
-          <w:bCs/>
-          <w:sz w:val="24"/>
-          <w:szCs w:val="24"/>
-          <w:lang w:val="tr-TR"/>
-        </w:rPr>
-        <w:t>the</w:t>
-      </w:r>
-      <w:proofErr w:type="spellEnd"/>
-      <w:r>
-        <w:rPr>
-          <w:rFonts w:ascii="Times New Roman" w:eastAsia="Times New Roman" w:hAnsi="Times New Roman" w:cs="Times New Roman"/>
-          <w:bCs/>
-          <w:sz w:val="24"/>
-          <w:szCs w:val="24"/>
-          <w:lang w:val="tr-TR"/>
-        </w:rPr>
-        <w:t xml:space="preserve"> </w:t>
+        <w:t xml:space="preserve"> the </w:t>
       </w:r>
       <w:proofErr w:type="spellStart"/>
       <w:r>
@@ -2930,7 +2732,7 @@
     </w:p>
     <w:p>
       <w:pPr>
-        <w:pStyle w:val="GvdeMetni"/>
+        <w:pStyle w:val="BodyText"/>
         <w:numPr>
           <w:ilvl w:val="0"/>
           <w:numId w:val="2"/>
@@ -3210,29 +3012,7 @@
           <w:szCs w:val="24"/>
           <w:lang w:val="tr-TR"/>
         </w:rPr>
-        <w:t xml:space="preserve"> </w:t>
-      </w:r>
-      <w:proofErr w:type="spellStart"/>
-      <w:r>
-        <w:rPr>
-          <w:rFonts w:ascii="Times New Roman" w:eastAsia="Times New Roman" w:hAnsi="Times New Roman" w:cs="Times New Roman"/>
-          <w:bCs/>
-          <w:sz w:val="24"/>
-          <w:szCs w:val="24"/>
-          <w:lang w:val="tr-TR"/>
-        </w:rPr>
-        <w:t>the</w:t>
-      </w:r>
-      <w:proofErr w:type="spellEnd"/>
-      <w:r>
-        <w:rPr>
-          <w:rFonts w:ascii="Times New Roman" w:eastAsia="Times New Roman" w:hAnsi="Times New Roman" w:cs="Times New Roman"/>
-          <w:bCs/>
-          <w:sz w:val="24"/>
-          <w:szCs w:val="24"/>
-          <w:lang w:val="tr-TR"/>
-        </w:rPr>
-        <w:t xml:space="preserve"> </w:t>
+        <w:t xml:space="preserve"> the </w:t>
       </w:r>
       <w:proofErr w:type="spellStart"/>
       <w:r>
@@ -3303,7 +3083,7 @@
     </w:p>
     <w:p>
       <w:pPr>
-        <w:pStyle w:val="GvdeMetni"/>
+        <w:pStyle w:val="BodyText"/>
         <w:numPr>
           <w:ilvl w:val="0"/>
           <w:numId w:val="2"/>
@@ -3363,29 +3143,7 @@
           <w:szCs w:val="24"/>
           <w:lang w:val="tr-TR"/>
         </w:rPr>
-        <w:t xml:space="preserve"> </w:t>
-      </w:r>
-      <w:proofErr w:type="spellStart"/>
-      <w:r>
-        <w:rPr>
-          <w:rFonts w:ascii="Times New Roman" w:eastAsia="Times New Roman" w:hAnsi="Times New Roman" w:cs="Times New Roman"/>
-          <w:bCs/>
-          <w:sz w:val="24"/>
-          <w:szCs w:val="24"/>
-          <w:lang w:val="tr-TR"/>
-        </w:rPr>
-        <w:t>the</w:t>
-      </w:r>
-      <w:proofErr w:type="spellEnd"/>
-      <w:r>
-        <w:rPr>
-          <w:rFonts w:ascii="Times New Roman" w:eastAsia="Times New Roman" w:hAnsi="Times New Roman" w:cs="Times New Roman"/>
-          <w:bCs/>
-          <w:sz w:val="24"/>
-          <w:szCs w:val="24"/>
-          <w:lang w:val="tr-TR"/>
-        </w:rPr>
-        <w:t xml:space="preserve"> </w:t>
+        <w:t xml:space="preserve"> the </w:t>
       </w:r>
       <w:proofErr w:type="spellStart"/>
       <w:r>
@@ -3646,10 +3404,10 @@
     </w:p>
     <w:p>
       <w:pPr>
-        <w:pStyle w:val="Balk3"/>
+        <w:pStyle w:val="Heading3"/>
         <w:spacing w:before="240" w:after="240"/>
         <w:rPr>
-          <w:rStyle w:val="Gl"/>
+          <w:rStyle w:val="Strong"/>
           <w:rFonts w:ascii="Times New Roman" w:hAnsi="Times New Roman" w:cs="Times New Roman"/>
           <w:color w:val="3465A4"/>
           <w:sz w:val="40"/>
@@ -3660,7 +3418,7 @@
     </w:p>
     <w:p>
       <w:pPr>
-        <w:pStyle w:val="Balk3"/>
+        <w:pStyle w:val="Heading3"/>
         <w:spacing w:before="240" w:after="240"/>
         <w:rPr>
           <w:rFonts w:ascii="Times New Roman" w:eastAsia="Times New Roman" w:hAnsi="Times New Roman" w:cs="Times New Roman"/>
@@ -3668,7 +3426,7 @@
       </w:pPr>
       <w:r>
         <w:rPr>
-          <w:rStyle w:val="Gl"/>
+          <w:rStyle w:val="Strong"/>
           <w:rFonts w:ascii="Times New Roman" w:eastAsia="Times New Roman" w:hAnsi="Times New Roman" w:cs="Times New Roman"/>
           <w:color w:val="3465A4"/>
           <w:sz w:val="40"/>
@@ -3680,7 +3438,7 @@
       <w:proofErr w:type="spellStart"/>
       <w:r>
         <w:rPr>
-          <w:rStyle w:val="Gl"/>
+          <w:rStyle w:val="Strong"/>
           <w:rFonts w:ascii="Times New Roman" w:eastAsia="Times New Roman" w:hAnsi="Times New Roman" w:cs="Times New Roman"/>
           <w:color w:val="3465A4"/>
           <w:sz w:val="40"/>
@@ -3693,7 +3451,7 @@
     </w:p>
     <w:p>
       <w:pPr>
-        <w:pStyle w:val="GvdeMetni"/>
+        <w:pStyle w:val="BodyText"/>
         <w:spacing w:before="240" w:after="240"/>
         <w:rPr>
           <w:rFonts w:ascii="Times New Roman" w:eastAsia="Times New Roman" w:hAnsi="Times New Roman" w:cs="Times New Roman"/>
@@ -3703,7 +3461,7 @@
       </w:pPr>
       <w:r>
         <w:rPr>
-          <w:rStyle w:val="Gl"/>
+          <w:rStyle w:val="Strong"/>
           <w:rFonts w:ascii="Times New Roman" w:eastAsia="Times New Roman" w:hAnsi="Times New Roman" w:cs="Times New Roman"/>
           <w:color w:val="5983B0"/>
           <w:sz w:val="30"/>
@@ -3716,7 +3474,7 @@
       <w:proofErr w:type="spellStart"/>
       <w:r>
         <w:rPr>
-          <w:rStyle w:val="Gl"/>
+          <w:rStyle w:val="Strong"/>
           <w:rFonts w:ascii="Times New Roman" w:eastAsia="Times New Roman" w:hAnsi="Times New Roman" w:cs="Times New Roman"/>
           <w:color w:val="5983B0"/>
           <w:sz w:val="30"/>
@@ -3729,7 +3487,7 @@
       <w:proofErr w:type="spellEnd"/>
       <w:r>
         <w:rPr>
-          <w:rStyle w:val="Gl"/>
+          <w:rStyle w:val="Strong"/>
           <w:rFonts w:ascii="Times New Roman" w:eastAsia="Times New Roman" w:hAnsi="Times New Roman" w:cs="Times New Roman"/>
           <w:color w:val="5983B0"/>
           <w:sz w:val="30"/>
@@ -3742,7 +3500,7 @@
       <w:proofErr w:type="spellStart"/>
       <w:r>
         <w:rPr>
-          <w:rStyle w:val="Gl"/>
+          <w:rStyle w:val="Strong"/>
           <w:rFonts w:ascii="Times New Roman" w:eastAsia="Times New Roman" w:hAnsi="Times New Roman" w:cs="Times New Roman"/>
           <w:color w:val="5983B0"/>
           <w:sz w:val="30"/>
@@ -3756,7 +3514,7 @@
     </w:p>
     <w:p>
       <w:pPr>
-        <w:pStyle w:val="GvdeMetni"/>
+        <w:pStyle w:val="BodyText"/>
         <w:numPr>
           <w:ilvl w:val="0"/>
           <w:numId w:val="3"/>
@@ -3953,7 +3711,7 @@
     </w:p>
     <w:p>
       <w:pPr>
-        <w:pStyle w:val="GvdeMetni"/>
+        <w:pStyle w:val="BodyText"/>
         <w:numPr>
           <w:ilvl w:val="0"/>
           <w:numId w:val="3"/>
@@ -4150,7 +3908,7 @@
     </w:p>
     <w:p>
       <w:pPr>
-        <w:pStyle w:val="GvdeMetni"/>
+        <w:pStyle w:val="BodyText"/>
         <w:numPr>
           <w:ilvl w:val="0"/>
           <w:numId w:val="3"/>
@@ -4303,7 +4061,7 @@
     </w:p>
     <w:p>
       <w:pPr>
-        <w:pStyle w:val="GvdeMetni"/>
+        <w:pStyle w:val="BodyText"/>
         <w:numPr>
           <w:ilvl w:val="0"/>
           <w:numId w:val="3"/>
@@ -4412,7 +4170,7 @@
     </w:p>
     <w:p>
       <w:pPr>
-        <w:pStyle w:val="GvdeMetni"/>
+        <w:pStyle w:val="BodyText"/>
         <w:numPr>
           <w:ilvl w:val="0"/>
           <w:numId w:val="3"/>
@@ -4450,29 +4208,7 @@
           <w:szCs w:val="24"/>
           <w:lang w:val="tr-TR"/>
         </w:rPr>
-        <w:t xml:space="preserve"> </w:t>
-      </w:r>
-      <w:proofErr w:type="spellStart"/>
-      <w:r>
-        <w:rPr>
-          <w:rFonts w:ascii="Times New Roman" w:eastAsia="Times New Roman" w:hAnsi="Times New Roman" w:cs="Times New Roman"/>
-          <w:color w:val="000000"/>
-          <w:sz w:val="24"/>
-          <w:szCs w:val="24"/>
-          <w:lang w:val="tr-TR"/>
-        </w:rPr>
-        <w:t>the</w:t>
-      </w:r>
-      <w:proofErr w:type="spellEnd"/>
-      <w:r>
-        <w:rPr>
-          <w:rFonts w:ascii="Times New Roman" w:eastAsia="Times New Roman" w:hAnsi="Times New Roman" w:cs="Times New Roman"/>
-          <w:color w:val="000000"/>
-          <w:sz w:val="24"/>
-          <w:szCs w:val="24"/>
-          <w:lang w:val="tr-TR"/>
-        </w:rPr>
-        <w:t xml:space="preserve"> </w:t>
+        <w:t xml:space="preserve"> the </w:t>
       </w:r>
       <w:proofErr w:type="spellStart"/>
       <w:r>
@@ -4587,7 +4323,7 @@
     </w:p>
     <w:p>
       <w:pPr>
-        <w:pStyle w:val="GvdeMetni"/>
+        <w:pStyle w:val="BodyText"/>
         <w:spacing w:before="240" w:after="240"/>
         <w:rPr>
           <w:rFonts w:ascii="Times New Roman" w:eastAsia="Times New Roman" w:hAnsi="Times New Roman" w:cs="Times New Roman"/>
@@ -4597,7 +4333,7 @@
       </w:pPr>
       <w:r>
         <w:rPr>
-          <w:rStyle w:val="Gl"/>
+          <w:rStyle w:val="Strong"/>
           <w:rFonts w:ascii="Times New Roman" w:eastAsia="Times New Roman" w:hAnsi="Times New Roman" w:cs="Times New Roman"/>
           <w:color w:val="5983B0"/>
           <w:sz w:val="30"/>
@@ -4610,7 +4346,7 @@
       <w:proofErr w:type="spellStart"/>
       <w:r>
         <w:rPr>
-          <w:rStyle w:val="Gl"/>
+          <w:rStyle w:val="Strong"/>
           <w:rFonts w:ascii="Times New Roman" w:eastAsia="Times New Roman" w:hAnsi="Times New Roman" w:cs="Times New Roman"/>
           <w:color w:val="5983B0"/>
           <w:sz w:val="30"/>
@@ -4623,7 +4359,7 @@
       <w:proofErr w:type="spellEnd"/>
       <w:r>
         <w:rPr>
-          <w:rStyle w:val="Gl"/>
+          <w:rStyle w:val="Strong"/>
           <w:rFonts w:ascii="Times New Roman" w:eastAsia="Times New Roman" w:hAnsi="Times New Roman" w:cs="Times New Roman"/>
           <w:color w:val="5983B0"/>
           <w:sz w:val="30"/>
@@ -4636,7 +4372,7 @@
       <w:proofErr w:type="spellStart"/>
       <w:r>
         <w:rPr>
-          <w:rStyle w:val="Gl"/>
+          <w:rStyle w:val="Strong"/>
           <w:rFonts w:ascii="Times New Roman" w:eastAsia="Times New Roman" w:hAnsi="Times New Roman" w:cs="Times New Roman"/>
           <w:color w:val="5983B0"/>
           <w:sz w:val="30"/>
@@ -4650,7 +4386,7 @@
     </w:p>
     <w:p>
       <w:pPr>
-        <w:pStyle w:val="GvdeMetni"/>
+        <w:pStyle w:val="BodyText"/>
         <w:numPr>
           <w:ilvl w:val="0"/>
           <w:numId w:val="4"/>
@@ -4668,27 +4404,15 @@
           <w:lang w:val="tr-TR"/>
         </w:rPr>
       </w:pPr>
-      <w:proofErr w:type="spellStart"/>
-      <w:r>
-        <w:rPr>
-          <w:rFonts w:ascii="Times New Roman" w:eastAsia="Times New Roman" w:hAnsi="Times New Roman" w:cs="Times New Roman"/>
-          <w:color w:val="000000"/>
-          <w:sz w:val="24"/>
-          <w:szCs w:val="24"/>
-          <w:lang w:val="tr-TR"/>
-        </w:rPr>
-        <w:t>The</w:t>
-      </w:r>
-      <w:proofErr w:type="spellEnd"/>
-      <w:r>
-        <w:rPr>
-          <w:rFonts w:ascii="Times New Roman" w:eastAsia="Times New Roman" w:hAnsi="Times New Roman" w:cs="Times New Roman"/>
-          <w:color w:val="000000"/>
-          <w:sz w:val="24"/>
-          <w:szCs w:val="24"/>
-          <w:lang w:val="tr-TR"/>
-        </w:rPr>
-        <w:t xml:space="preserve"> </w:t>
+      <w:r>
+        <w:rPr>
+          <w:rFonts w:ascii="Times New Roman" w:eastAsia="Times New Roman" w:hAnsi="Times New Roman" w:cs="Times New Roman"/>
+          <w:color w:val="000000"/>
+          <w:sz w:val="24"/>
+          <w:szCs w:val="24"/>
+          <w:lang w:val="tr-TR"/>
+        </w:rPr>
+        <w:t xml:space="preserve">The </w:t>
       </w:r>
       <w:proofErr w:type="spellStart"/>
       <w:r>
@@ -5023,7 +4747,7 @@
     </w:p>
     <w:p>
       <w:pPr>
-        <w:pStyle w:val="GvdeMetni"/>
+        <w:pStyle w:val="BodyText"/>
         <w:numPr>
           <w:ilvl w:val="0"/>
           <w:numId w:val="4"/>
@@ -5308,7 +5032,7 @@
     </w:p>
     <w:p>
       <w:pPr>
-        <w:pStyle w:val="GvdeMetni"/>
+        <w:pStyle w:val="BodyText"/>
         <w:numPr>
           <w:ilvl w:val="0"/>
           <w:numId w:val="4"/>
@@ -5532,29 +5256,7 @@
           <w:szCs w:val="24"/>
           <w:lang w:val="tr-TR"/>
         </w:rPr>
-        <w:t xml:space="preserve"> </w:t>
-      </w:r>
-      <w:proofErr w:type="spellStart"/>
-      <w:r>
-        <w:rPr>
-          <w:rFonts w:ascii="Times New Roman" w:eastAsia="Times New Roman" w:hAnsi="Times New Roman" w:cs="Times New Roman"/>
-          <w:color w:val="000000"/>
-          <w:sz w:val="24"/>
-          <w:szCs w:val="24"/>
-          <w:lang w:val="tr-TR"/>
-        </w:rPr>
-        <w:t>the</w:t>
-      </w:r>
-      <w:proofErr w:type="spellEnd"/>
-      <w:r>
-        <w:rPr>
-          <w:rFonts w:ascii="Times New Roman" w:eastAsia="Times New Roman" w:hAnsi="Times New Roman" w:cs="Times New Roman"/>
-          <w:color w:val="000000"/>
-          <w:sz w:val="24"/>
-          <w:szCs w:val="24"/>
-          <w:lang w:val="tr-TR"/>
-        </w:rPr>
-        <w:t xml:space="preserve"> </w:t>
+        <w:t xml:space="preserve"> the </w:t>
       </w:r>
       <w:proofErr w:type="spellStart"/>
       <w:r>
@@ -5634,7 +5336,7 @@
     </w:p>
     <w:p>
       <w:pPr>
-        <w:pStyle w:val="Balk3"/>
+        <w:pStyle w:val="Heading3"/>
         <w:spacing w:before="240" w:after="240"/>
         <w:rPr>
           <w:rFonts w:ascii="Times New Roman" w:eastAsia="Times New Roman" w:hAnsi="Times New Roman" w:cs="Times New Roman"/>
@@ -5643,7 +5345,7 @@
       </w:pPr>
       <w:r>
         <w:rPr>
-          <w:rStyle w:val="Gl"/>
+          <w:rStyle w:val="Strong"/>
           <w:rFonts w:ascii="Times New Roman" w:eastAsia="Times New Roman" w:hAnsi="Times New Roman" w:cs="Times New Roman"/>
           <w:color w:val="3465A4"/>
           <w:sz w:val="40"/>
@@ -5655,7 +5357,7 @@
     </w:p>
     <w:p>
       <w:pPr>
-        <w:pStyle w:val="GvdeMetni"/>
+        <w:pStyle w:val="BodyText"/>
         <w:spacing w:before="240" w:after="240"/>
         <w:rPr>
           <w:rFonts w:ascii="Times New Roman" w:eastAsia="Times New Roman" w:hAnsi="Times New Roman" w:cs="Times New Roman"/>
@@ -5665,7 +5367,7 @@
       </w:pPr>
       <w:r>
         <w:rPr>
-          <w:rStyle w:val="Gl"/>
+          <w:rStyle w:val="Strong"/>
           <w:rFonts w:ascii="Times New Roman" w:eastAsia="Times New Roman" w:hAnsi="Times New Roman" w:cs="Times New Roman"/>
           <w:color w:val="5983B0"/>
           <w:sz w:val="30"/>
@@ -5678,7 +5380,7 @@
       <w:proofErr w:type="spellStart"/>
       <w:r>
         <w:rPr>
-          <w:rStyle w:val="Gl"/>
+          <w:rStyle w:val="Strong"/>
           <w:rFonts w:ascii="Times New Roman" w:eastAsia="Times New Roman" w:hAnsi="Times New Roman" w:cs="Times New Roman"/>
           <w:color w:val="5983B0"/>
           <w:sz w:val="30"/>
@@ -5691,7 +5393,7 @@
       <w:proofErr w:type="spellEnd"/>
       <w:r>
         <w:rPr>
-          <w:rStyle w:val="Gl"/>
+          <w:rStyle w:val="Strong"/>
           <w:rFonts w:ascii="Times New Roman" w:eastAsia="Times New Roman" w:hAnsi="Times New Roman" w:cs="Times New Roman"/>
           <w:color w:val="5983B0"/>
           <w:sz w:val="30"/>
@@ -5704,7 +5406,7 @@
       <w:proofErr w:type="spellStart"/>
       <w:r>
         <w:rPr>
-          <w:rStyle w:val="Gl"/>
+          <w:rStyle w:val="Strong"/>
           <w:rFonts w:ascii="Times New Roman" w:eastAsia="Times New Roman" w:hAnsi="Times New Roman" w:cs="Times New Roman"/>
           <w:color w:val="5983B0"/>
           <w:sz w:val="30"/>
@@ -5718,7 +5420,7 @@
     </w:p>
     <w:p>
       <w:pPr>
-        <w:pStyle w:val="GvdeMetni"/>
+        <w:pStyle w:val="BodyText"/>
         <w:numPr>
           <w:ilvl w:val="0"/>
           <w:numId w:val="5"/>
@@ -5737,7 +5439,7 @@
       <w:proofErr w:type="spellStart"/>
       <w:r>
         <w:rPr>
-          <w:rStyle w:val="Gl"/>
+          <w:rStyle w:val="Strong"/>
           <w:rFonts w:ascii="Times New Roman" w:eastAsia="Times New Roman" w:hAnsi="Times New Roman" w:cs="Times New Roman"/>
           <w:color w:val="5983B0"/>
           <w:sz w:val="24"/>
@@ -5749,7 +5451,7 @@
       <w:proofErr w:type="spellEnd"/>
       <w:r>
         <w:rPr>
-          <w:rStyle w:val="Gl"/>
+          <w:rStyle w:val="Strong"/>
           <w:rFonts w:ascii="Times New Roman" w:eastAsia="Times New Roman" w:hAnsi="Times New Roman" w:cs="Times New Roman"/>
           <w:color w:val="5983B0"/>
           <w:sz w:val="24"/>
@@ -5876,29 +5578,7 @@
           <w:szCs w:val="24"/>
           <w:lang w:val="tr-TR"/>
         </w:rPr>
-        <w:t xml:space="preserve"> of </w:t>
-      </w:r>
-      <w:proofErr w:type="spellStart"/>
-      <w:r>
-        <w:rPr>
-          <w:rFonts w:ascii="Times New Roman" w:eastAsia="Times New Roman" w:hAnsi="Times New Roman" w:cs="Times New Roman"/>
-          <w:color w:val="000000"/>
-          <w:sz w:val="24"/>
-          <w:szCs w:val="24"/>
-          <w:lang w:val="tr-TR"/>
-        </w:rPr>
-        <w:t>the</w:t>
-      </w:r>
-      <w:proofErr w:type="spellEnd"/>
-      <w:r>
-        <w:rPr>
-          <w:rFonts w:ascii="Times New Roman" w:eastAsia="Times New Roman" w:hAnsi="Times New Roman" w:cs="Times New Roman"/>
-          <w:color w:val="000000"/>
-          <w:sz w:val="24"/>
-          <w:szCs w:val="24"/>
-          <w:lang w:val="tr-TR"/>
-        </w:rPr>
-        <w:t xml:space="preserve"> </w:t>
+        <w:t xml:space="preserve"> of the </w:t>
       </w:r>
       <w:proofErr w:type="spellStart"/>
       <w:r>
@@ -5975,29 +5655,7 @@
           <w:szCs w:val="24"/>
           <w:lang w:val="tr-TR"/>
         </w:rPr>
-        <w:t xml:space="preserve"> </w:t>
-      </w:r>
-      <w:proofErr w:type="spellStart"/>
-      <w:r>
-        <w:rPr>
-          <w:rFonts w:ascii="Times New Roman" w:eastAsia="Times New Roman" w:hAnsi="Times New Roman" w:cs="Times New Roman"/>
-          <w:color w:val="000000"/>
-          <w:sz w:val="24"/>
-          <w:szCs w:val="24"/>
-          <w:lang w:val="tr-TR"/>
-        </w:rPr>
-        <w:t>the</w:t>
-      </w:r>
-      <w:proofErr w:type="spellEnd"/>
-      <w:r>
-        <w:rPr>
-          <w:rFonts w:ascii="Times New Roman" w:eastAsia="Times New Roman" w:hAnsi="Times New Roman" w:cs="Times New Roman"/>
-          <w:color w:val="000000"/>
-          <w:sz w:val="24"/>
-          <w:szCs w:val="24"/>
-          <w:lang w:val="tr-TR"/>
-        </w:rPr>
-        <w:t xml:space="preserve"> </w:t>
+        <w:t xml:space="preserve"> the </w:t>
       </w:r>
       <w:proofErr w:type="spellStart"/>
       <w:r>
@@ -6266,7 +5924,7 @@
     </w:p>
     <w:p>
       <w:pPr>
-        <w:pStyle w:val="GvdeMetni"/>
+        <w:pStyle w:val="BodyText"/>
         <w:numPr>
           <w:ilvl w:val="0"/>
           <w:numId w:val="5"/>
@@ -6284,7 +5942,7 @@
       </w:pPr>
       <w:r>
         <w:rPr>
-          <w:rStyle w:val="Gl"/>
+          <w:rStyle w:val="Strong"/>
           <w:rFonts w:ascii="Times New Roman" w:eastAsia="Times New Roman" w:hAnsi="Times New Roman" w:cs="Times New Roman"/>
           <w:color w:val="5983B0"/>
           <w:sz w:val="24"/>
@@ -6510,29 +6168,7 @@
           <w:szCs w:val="24"/>
           <w:lang w:val="tr-TR"/>
         </w:rPr>
-        <w:t xml:space="preserve"> </w:t>
-      </w:r>
-      <w:proofErr w:type="spellStart"/>
-      <w:r>
-        <w:rPr>
-          <w:rFonts w:ascii="Times New Roman" w:eastAsia="Times New Roman" w:hAnsi="Times New Roman" w:cs="Times New Roman"/>
-          <w:color w:val="000000"/>
-          <w:sz w:val="24"/>
-          <w:szCs w:val="24"/>
-          <w:lang w:val="tr-TR"/>
-        </w:rPr>
-        <w:t>the</w:t>
-      </w:r>
-      <w:proofErr w:type="spellEnd"/>
-      <w:r>
-        <w:rPr>
-          <w:rFonts w:ascii="Times New Roman" w:eastAsia="Times New Roman" w:hAnsi="Times New Roman" w:cs="Times New Roman"/>
-          <w:color w:val="000000"/>
-          <w:sz w:val="24"/>
-          <w:szCs w:val="24"/>
-          <w:lang w:val="tr-TR"/>
-        </w:rPr>
-        <w:t xml:space="preserve"> </w:t>
+        <w:t xml:space="preserve"> the </w:t>
       </w:r>
       <w:proofErr w:type="spellStart"/>
       <w:r>
@@ -6598,29 +6234,7 @@
           <w:szCs w:val="24"/>
           <w:lang w:val="tr-TR"/>
         </w:rPr>
-        <w:t xml:space="preserve"> </w:t>
-      </w:r>
-      <w:proofErr w:type="spellStart"/>
-      <w:r>
-        <w:rPr>
-          <w:rFonts w:ascii="Times New Roman" w:eastAsia="Times New Roman" w:hAnsi="Times New Roman" w:cs="Times New Roman"/>
-          <w:color w:val="000000"/>
-          <w:sz w:val="24"/>
-          <w:szCs w:val="24"/>
-          <w:lang w:val="tr-TR"/>
-        </w:rPr>
-        <w:t>the</w:t>
-      </w:r>
-      <w:proofErr w:type="spellEnd"/>
-      <w:r>
-        <w:rPr>
-          <w:rFonts w:ascii="Times New Roman" w:eastAsia="Times New Roman" w:hAnsi="Times New Roman" w:cs="Times New Roman"/>
-          <w:color w:val="000000"/>
-          <w:sz w:val="24"/>
-          <w:szCs w:val="24"/>
-          <w:lang w:val="tr-TR"/>
-        </w:rPr>
-        <w:t xml:space="preserve"> </w:t>
+        <w:t xml:space="preserve"> the </w:t>
       </w:r>
       <w:proofErr w:type="spellStart"/>
       <w:r>
@@ -6953,7 +6567,7 @@
     </w:p>
     <w:p>
       <w:pPr>
-        <w:pStyle w:val="Balk3"/>
+        <w:pStyle w:val="Heading3"/>
         <w:spacing w:before="240" w:after="240"/>
         <w:rPr>
           <w:rFonts w:ascii="Times New Roman" w:eastAsia="Times New Roman" w:hAnsi="Times New Roman" w:cs="Times New Roman"/>
@@ -6962,7 +6576,7 @@
       </w:pPr>
       <w:r>
         <w:rPr>
-          <w:rStyle w:val="Gl"/>
+          <w:rStyle w:val="Strong"/>
           <w:rFonts w:ascii="Times New Roman" w:eastAsia="Times New Roman" w:hAnsi="Times New Roman" w:cs="Times New Roman"/>
           <w:color w:val="3465A4"/>
           <w:sz w:val="40"/>
@@ -6973,7 +6587,7 @@
     </w:p>
     <w:p>
       <w:pPr>
-        <w:pStyle w:val="GvdeMetni"/>
+        <w:pStyle w:val="BodyText"/>
         <w:spacing w:before="240" w:after="240"/>
         <w:rPr>
           <w:rFonts w:ascii="Times New Roman" w:eastAsia="Times New Roman" w:hAnsi="Times New Roman" w:cs="Times New Roman"/>
@@ -6982,7 +6596,7 @@
       </w:pPr>
       <w:r>
         <w:rPr>
-          <w:rStyle w:val="Gl"/>
+          <w:rStyle w:val="Strong"/>
           <w:rFonts w:ascii="Times New Roman" w:eastAsia="Times New Roman" w:hAnsi="Times New Roman" w:cs="Times New Roman"/>
           <w:color w:val="5983B0"/>
           <w:sz w:val="30"/>
@@ -6994,7 +6608,7 @@
     </w:p>
     <w:p>
       <w:pPr>
-        <w:pStyle w:val="GvdeMetni"/>
+        <w:pStyle w:val="BodyText"/>
         <w:spacing w:before="240" w:after="240"/>
         <w:rPr>
           <w:rFonts w:ascii="Times New Roman" w:eastAsia="Times New Roman" w:hAnsi="Times New Roman" w:cs="Times New Roman"/>
@@ -7032,7 +6646,7 @@
     </w:p>
     <w:p>
       <w:pPr>
-        <w:pStyle w:val="GvdeMetni"/>
+        <w:pStyle w:val="BodyText"/>
         <w:spacing w:before="240" w:after="240"/>
         <w:ind w:left="720" w:firstLine="60"/>
         <w:rPr>
@@ -7042,7 +6656,7 @@
       </w:pPr>
       <w:r>
         <w:rPr>
-          <w:rStyle w:val="Gl"/>
+          <w:rStyle w:val="Strong"/>
           <w:rFonts w:ascii="Times New Roman" w:eastAsia="Times New Roman" w:hAnsi="Times New Roman" w:cs="Times New Roman"/>
           <w:color w:val="5983B0"/>
           <w:sz w:val="24"/>
@@ -7052,7 +6666,7 @@
       </w:r>
       <w:r>
         <w:rPr>
-          <w:rStyle w:val="Gl"/>
+          <w:rStyle w:val="Strong"/>
           <w:rFonts w:ascii="Times New Roman" w:eastAsia="Times New Roman" w:hAnsi="Times New Roman" w:cs="Times New Roman"/>
           <w:color w:val="5983B0"/>
           <w:sz w:val="24"/>
@@ -7079,7 +6693,7 @@
     </w:p>
     <w:p>
       <w:pPr>
-        <w:pStyle w:val="GvdeMetni"/>
+        <w:pStyle w:val="BodyText"/>
         <w:spacing w:before="240" w:after="240"/>
         <w:rPr>
           <w:rFonts w:ascii="Times New Roman" w:eastAsia="Times New Roman" w:hAnsi="Times New Roman" w:cs="Times New Roman"/>
@@ -7088,7 +6702,7 @@
       </w:pPr>
       <w:r>
         <w:rPr>
-          <w:rStyle w:val="Gl"/>
+          <w:rStyle w:val="Strong"/>
           <w:rFonts w:ascii="Times New Roman" w:eastAsia="Times New Roman" w:hAnsi="Times New Roman" w:cs="Times New Roman"/>
           <w:color w:val="5983B0"/>
           <w:sz w:val="30"/>
@@ -7099,7 +6713,7 @@
       </w:r>
       <w:r>
         <w:rPr>
-          <w:rStyle w:val="Gl"/>
+          <w:rStyle w:val="Strong"/>
           <w:rFonts w:ascii="Times New Roman" w:eastAsia="Times New Roman" w:hAnsi="Times New Roman" w:cs="Times New Roman"/>
           <w:color w:val="5983B0"/>
           <w:sz w:val="30"/>
@@ -7110,7 +6724,7 @@
       </w:r>
       <w:r>
         <w:rPr>
-          <w:rStyle w:val="Gl"/>
+          <w:rStyle w:val="Strong"/>
           <w:rFonts w:ascii="Times New Roman" w:eastAsia="Times New Roman" w:hAnsi="Times New Roman" w:cs="Times New Roman"/>
           <w:color w:val="5983B0"/>
           <w:sz w:val="30"/>
@@ -7122,7 +6736,7 @@
     </w:p>
     <w:p>
       <w:pPr>
-        <w:pStyle w:val="GvdeMetni"/>
+        <w:pStyle w:val="BodyText"/>
         <w:spacing w:before="240" w:after="240"/>
         <w:rPr>
           <w:rFonts w:ascii="Times New Roman" w:eastAsia="Times New Roman" w:hAnsi="Times New Roman" w:cs="Times New Roman"/>
@@ -7161,7 +6775,7 @@
     </w:p>
     <w:p>
       <w:pPr>
-        <w:pStyle w:val="GvdeMetni"/>
+        <w:pStyle w:val="BodyText"/>
         <w:spacing w:before="240" w:after="240"/>
         <w:ind w:left="720"/>
         <w:rPr>
@@ -7173,7 +6787,7 @@
       </w:pPr>
       <w:r>
         <w:rPr>
-          <w:rStyle w:val="Gl"/>
+          <w:rStyle w:val="Strong"/>
           <w:rFonts w:ascii="Times New Roman" w:eastAsia="Times New Roman" w:hAnsi="Times New Roman" w:cs="Times New Roman"/>
           <w:color w:val="5983B0"/>
           <w:sz w:val="24"/>
@@ -7202,7 +6816,7 @@
     </w:p>
     <w:p>
       <w:pPr>
-        <w:pStyle w:val="GvdeMetni"/>
+        <w:pStyle w:val="BodyText"/>
         <w:spacing w:before="240" w:after="240"/>
         <w:rPr>
           <w:rFonts w:ascii="Times New Roman" w:eastAsia="Times New Roman" w:hAnsi="Times New Roman" w:cs="Times New Roman"/>
@@ -7211,7 +6825,7 @@
       </w:pPr>
       <w:r>
         <w:rPr>
-          <w:rStyle w:val="Gl"/>
+          <w:rStyle w:val="Strong"/>
           <w:rFonts w:ascii="Times New Roman" w:eastAsia="Times New Roman" w:hAnsi="Times New Roman" w:cs="Times New Roman"/>
           <w:color w:val="5983B0"/>
           <w:sz w:val="30"/>
@@ -7222,7 +6836,7 @@
       </w:r>
       <w:r>
         <w:rPr>
-          <w:rStyle w:val="Gl"/>
+          <w:rStyle w:val="Strong"/>
           <w:rFonts w:ascii="Times New Roman" w:eastAsia="Times New Roman" w:hAnsi="Times New Roman" w:cs="Times New Roman"/>
           <w:color w:val="5983B0"/>
           <w:sz w:val="30"/>
@@ -7233,7 +6847,7 @@
       </w:r>
       <w:r>
         <w:rPr>
-          <w:rStyle w:val="Gl"/>
+          <w:rStyle w:val="Strong"/>
           <w:rFonts w:ascii="Times New Roman" w:eastAsia="Times New Roman" w:hAnsi="Times New Roman" w:cs="Times New Roman"/>
           <w:color w:val="5983B0"/>
           <w:sz w:val="30"/>
@@ -7263,7 +6877,7 @@
     </w:p>
     <w:p>
       <w:pPr>
-        <w:pStyle w:val="Balk3"/>
+        <w:pStyle w:val="Heading3"/>
         <w:spacing w:before="240" w:after="240"/>
         <w:rPr>
           <w:rFonts w:ascii="Times New Roman" w:eastAsia="Times New Roman" w:hAnsi="Times New Roman" w:cs="Times New Roman"/>
@@ -7272,7 +6886,7 @@
       </w:pPr>
       <w:r>
         <w:rPr>
-          <w:rStyle w:val="Gl"/>
+          <w:rStyle w:val="Strong"/>
           <w:rFonts w:ascii="Times New Roman" w:eastAsia="Times New Roman" w:hAnsi="Times New Roman" w:cs="Times New Roman"/>
           <w:color w:val="3465A4"/>
           <w:sz w:val="40"/>
@@ -7283,7 +6897,7 @@
     </w:p>
     <w:p>
       <w:pPr>
-        <w:pStyle w:val="GvdeMetni"/>
+        <w:pStyle w:val="BodyText"/>
         <w:spacing w:before="240" w:after="240"/>
         <w:rPr>
           <w:rFonts w:ascii="Times New Roman" w:eastAsia="Times New Roman" w:hAnsi="Times New Roman" w:cs="Times New Roman"/>
@@ -7292,7 +6906,7 @@
       </w:pPr>
       <w:r>
         <w:rPr>
-          <w:rStyle w:val="Gl"/>
+          <w:rStyle w:val="Strong"/>
           <w:rFonts w:ascii="Times New Roman" w:eastAsia="Times New Roman" w:hAnsi="Times New Roman" w:cs="Times New Roman"/>
           <w:color w:val="5983B0"/>
           <w:sz w:val="30"/>
@@ -7304,7 +6918,7 @@
     </w:p>
     <w:p>
       <w:pPr>
-        <w:pStyle w:val="GvdeMetni"/>
+        <w:pStyle w:val="BodyText"/>
         <w:spacing w:before="240" w:after="240"/>
         <w:rPr>
           <w:rFonts w:ascii="Times New Roman" w:eastAsia="Times New Roman" w:hAnsi="Times New Roman" w:cs="Times New Roman"/>
@@ -7315,7 +6929,7 @@
       </w:pPr>
       <w:r>
         <w:rPr>
-          <w:rStyle w:val="Gl"/>
+          <w:rStyle w:val="Strong"/>
           <w:rFonts w:ascii="Times New Roman" w:eastAsia="Times New Roman" w:hAnsi="Times New Roman" w:cs="Times New Roman"/>
           <w:color w:val="5983B0"/>
           <w:sz w:val="30"/>
@@ -7335,10 +6949,10 @@
     </w:p>
     <w:p>
       <w:pPr>
-        <w:pStyle w:val="GvdeMetni"/>
+        <w:pStyle w:val="BodyText"/>
         <w:spacing w:before="240" w:after="240"/>
         <w:rPr>
-          <w:rStyle w:val="Gl"/>
+          <w:rStyle w:val="Strong"/>
           <w:rFonts w:ascii="Times New Roman" w:hAnsi="Times New Roman" w:cs="Times New Roman"/>
           <w:color w:val="5983B0"/>
           <w:sz w:val="30"/>
@@ -7349,10 +6963,10 @@
     </w:p>
     <w:p>
       <w:pPr>
-        <w:pStyle w:val="GvdeMetni"/>
+        <w:pStyle w:val="BodyText"/>
         <w:spacing w:before="240" w:after="240"/>
         <w:rPr>
-          <w:rStyle w:val="Gl"/>
+          <w:rStyle w:val="Strong"/>
           <w:rFonts w:ascii="Times New Roman" w:hAnsi="Times New Roman" w:cs="Times New Roman"/>
           <w:color w:val="5983B0"/>
           <w:sz w:val="30"/>
@@ -7363,10 +6977,10 @@
     </w:p>
     <w:p>
       <w:pPr>
-        <w:pStyle w:val="GvdeMetni"/>
+        <w:pStyle w:val="BodyText"/>
         <w:spacing w:before="240" w:after="240"/>
         <w:rPr>
-          <w:rStyle w:val="Gl"/>
+          <w:rStyle w:val="Strong"/>
           <w:rFonts w:ascii="Times New Roman" w:hAnsi="Times New Roman" w:cs="Times New Roman"/>
           <w:color w:val="5983B0"/>
           <w:sz w:val="30"/>
@@ -7377,10 +6991,10 @@
     </w:p>
     <w:p>
       <w:pPr>
-        <w:pStyle w:val="GvdeMetni"/>
+        <w:pStyle w:val="BodyText"/>
         <w:spacing w:before="240" w:after="240"/>
         <w:rPr>
-          <w:rStyle w:val="Gl"/>
+          <w:rStyle w:val="Strong"/>
           <w:rFonts w:ascii="Times New Roman" w:hAnsi="Times New Roman" w:cs="Times New Roman"/>
           <w:color w:val="5983B0"/>
           <w:sz w:val="30"/>
@@ -7391,7 +7005,7 @@
     </w:p>
     <w:p>
       <w:pPr>
-        <w:pStyle w:val="GvdeMetni"/>
+        <w:pStyle w:val="BodyText"/>
         <w:spacing w:before="240" w:after="240"/>
         <w:rPr>
           <w:rFonts w:ascii="Times New Roman" w:eastAsia="Times New Roman" w:hAnsi="Times New Roman" w:cs="Times New Roman"/>
@@ -7400,7 +7014,7 @@
       </w:pPr>
       <w:r>
         <w:rPr>
-          <w:rStyle w:val="Gl"/>
+          <w:rStyle w:val="Strong"/>
           <w:rFonts w:ascii="Times New Roman" w:eastAsia="Times New Roman" w:hAnsi="Times New Roman" w:cs="Times New Roman"/>
           <w:color w:val="5983B0"/>
           <w:sz w:val="30"/>
@@ -7413,7 +7027,7 @@
     </w:p>
     <w:p>
       <w:pPr>
-        <w:pStyle w:val="GvdeMetni"/>
+        <w:pStyle w:val="BodyText"/>
         <w:spacing w:before="240" w:after="240"/>
         <w:rPr>
           <w:rFonts w:ascii="Times New Roman" w:eastAsia="Times New Roman" w:hAnsi="Times New Roman" w:cs="Times New Roman"/>
@@ -7424,7 +7038,7 @@
       </w:pPr>
       <w:r>
         <w:rPr>
-          <w:rStyle w:val="Gl"/>
+          <w:rStyle w:val="Strong"/>
           <w:rFonts w:ascii="Times New Roman" w:eastAsia="Times New Roman" w:hAnsi="Times New Roman" w:cs="Times New Roman"/>
           <w:color w:val="5983B0"/>
           <w:sz w:val="30"/>
@@ -7444,7 +7058,7 @@
     </w:p>
     <w:p>
       <w:pPr>
-        <w:pStyle w:val="GvdeMetni"/>
+        <w:pStyle w:val="BodyText"/>
         <w:spacing w:before="240" w:after="240"/>
         <w:rPr>
           <w:rFonts w:ascii="Times New Roman" w:eastAsia="Times New Roman" w:hAnsi="Times New Roman" w:cs="Times New Roman"/>
@@ -7453,7 +7067,7 @@
       </w:pPr>
       <w:r>
         <w:rPr>
-          <w:rStyle w:val="Gl"/>
+          <w:rStyle w:val="Strong"/>
           <w:rFonts w:ascii="Times New Roman" w:eastAsia="Times New Roman" w:hAnsi="Times New Roman" w:cs="Times New Roman"/>
           <w:color w:val="5983B0"/>
           <w:sz w:val="30"/>
@@ -7477,7 +7091,7 @@
     </w:p>
     <w:p>
       <w:pPr>
-        <w:pStyle w:val="GvdeMetni"/>
+        <w:pStyle w:val="BodyText"/>
         <w:spacing w:before="240" w:after="240"/>
         <w:rPr>
           <w:rFonts w:ascii="Times New Roman" w:eastAsia="Times New Roman" w:hAnsi="Times New Roman" w:cs="Times New Roman"/>
@@ -7486,7 +7100,7 @@
       </w:pPr>
       <w:r>
         <w:rPr>
-          <w:rStyle w:val="Gl"/>
+          <w:rStyle w:val="Strong"/>
           <w:rFonts w:ascii="Times New Roman" w:eastAsia="Times New Roman" w:hAnsi="Times New Roman" w:cs="Times New Roman"/>
           <w:color w:val="5983B0"/>
           <w:sz w:val="30"/>
@@ -7510,7 +7124,7 @@
     </w:p>
     <w:p>
       <w:pPr>
-        <w:pStyle w:val="GvdeMetni"/>
+        <w:pStyle w:val="BodyText"/>
         <w:spacing w:before="240" w:after="240"/>
         <w:rPr>
           <w:rFonts w:ascii="Times New Roman" w:eastAsia="Times New Roman" w:hAnsi="Times New Roman" w:cs="Times New Roman"/>
@@ -7519,7 +7133,7 @@
       </w:pPr>
       <w:r>
         <w:rPr>
-          <w:rStyle w:val="Gl"/>
+          <w:rStyle w:val="Strong"/>
           <w:rFonts w:ascii="Times New Roman" w:eastAsia="Times New Roman" w:hAnsi="Times New Roman" w:cs="Times New Roman"/>
           <w:color w:val="5983B0"/>
           <w:sz w:val="30"/>
@@ -7531,7 +7145,7 @@
     </w:p>
     <w:p>
       <w:pPr>
-        <w:pStyle w:val="GvdeMetni"/>
+        <w:pStyle w:val="BodyText"/>
         <w:spacing w:before="240" w:after="240"/>
         <w:rPr>
           <w:rFonts w:ascii="Times New Roman" w:eastAsia="Times New Roman" w:hAnsi="Times New Roman" w:cs="Times New Roman"/>
@@ -7542,7 +7156,7 @@
       </w:pPr>
       <w:r>
         <w:rPr>
-          <w:rStyle w:val="Gl"/>
+          <w:rStyle w:val="Strong"/>
           <w:rFonts w:ascii="Times New Roman" w:eastAsia="Times New Roman" w:hAnsi="Times New Roman" w:cs="Times New Roman"/>
           <w:color w:val="5983B0"/>
           <w:sz w:val="30"/>
@@ -7562,7 +7176,7 @@
     </w:p>
     <w:p>
       <w:pPr>
-        <w:pStyle w:val="GvdeMetni"/>
+        <w:pStyle w:val="BodyText"/>
         <w:spacing w:before="240" w:after="240"/>
         <w:rPr>
           <w:rFonts w:ascii="Times New Roman" w:eastAsia="Times New Roman" w:hAnsi="Times New Roman" w:cs="Times New Roman"/>
@@ -7571,7 +7185,7 @@
       </w:pPr>
       <w:r>
         <w:rPr>
-          <w:rStyle w:val="Gl"/>
+          <w:rStyle w:val="Strong"/>
           <w:rFonts w:ascii="Times New Roman" w:eastAsia="Times New Roman" w:hAnsi="Times New Roman" w:cs="Times New Roman"/>
           <w:color w:val="5983B0"/>
           <w:sz w:val="30"/>
@@ -7599,7 +7213,7 @@
     </w:p>
     <w:p>
       <w:pPr>
-        <w:pStyle w:val="Balk3"/>
+        <w:pStyle w:val="Heading3"/>
         <w:spacing w:before="240" w:after="240"/>
         <w:rPr>
           <w:rFonts w:ascii="Times New Roman" w:eastAsia="Times New Roman" w:hAnsi="Times New Roman" w:cs="Times New Roman"/>
@@ -7609,7 +7223,7 @@
       </w:pPr>
       <w:r>
         <w:rPr>
-          <w:rStyle w:val="Gl"/>
+          <w:rStyle w:val="Strong"/>
           <w:rFonts w:ascii="Times New Roman" w:eastAsia="Times New Roman" w:hAnsi="Times New Roman" w:cs="Times New Roman"/>
           <w:color w:val="3465A4"/>
           <w:sz w:val="40"/>
@@ -7621,7 +7235,7 @@
       <w:proofErr w:type="spellStart"/>
       <w:r>
         <w:rPr>
-          <w:rStyle w:val="Gl"/>
+          <w:rStyle w:val="Strong"/>
           <w:rFonts w:ascii="Times New Roman" w:eastAsia="Times New Roman" w:hAnsi="Times New Roman" w:cs="Times New Roman"/>
           <w:color w:val="3465A4"/>
           <w:sz w:val="40"/>
@@ -7634,7 +7248,7 @@
     </w:p>
     <w:p>
       <w:pPr>
-        <w:pStyle w:val="Balk3"/>
+        <w:pStyle w:val="Heading3"/>
         <w:spacing w:before="240" w:after="240"/>
         <w:rPr>
           <w:rFonts w:ascii="Times New Roman" w:eastAsia="Times New Roman" w:hAnsi="Times New Roman" w:cs="Times New Roman"/>
@@ -7644,7 +7258,7 @@
       </w:pPr>
       <w:r>
         <w:rPr>
-          <w:rStyle w:val="Gl"/>
+          <w:rStyle w:val="Strong"/>
           <w:rFonts w:ascii="Times New Roman" w:eastAsia="Times New Roman" w:hAnsi="Times New Roman" w:cs="Times New Roman"/>
           <w:color w:val="5983B0"/>
           <w:sz w:val="30"/>
@@ -7657,7 +7271,7 @@
       <w:proofErr w:type="spellStart"/>
       <w:r>
         <w:rPr>
-          <w:rStyle w:val="Gl"/>
+          <w:rStyle w:val="Strong"/>
           <w:rFonts w:ascii="Times New Roman" w:eastAsia="Times New Roman" w:hAnsi="Times New Roman" w:cs="Times New Roman"/>
           <w:color w:val="5983B0"/>
           <w:sz w:val="30"/>
@@ -7670,7 +7284,7 @@
       <w:proofErr w:type="spellEnd"/>
       <w:r>
         <w:rPr>
-          <w:rStyle w:val="Gl"/>
+          <w:rStyle w:val="Strong"/>
           <w:rFonts w:ascii="Times New Roman" w:eastAsia="Times New Roman" w:hAnsi="Times New Roman" w:cs="Times New Roman"/>
           <w:color w:val="5983B0"/>
           <w:sz w:val="30"/>
@@ -7683,7 +7297,7 @@
     </w:p>
     <w:p>
       <w:pPr>
-        <w:pStyle w:val="Balk3"/>
+        <w:pStyle w:val="Heading3"/>
         <w:spacing w:before="240" w:after="240"/>
         <w:rPr>
           <w:rFonts w:ascii="Times New Roman" w:eastAsia="Times New Roman" w:hAnsi="Times New Roman" w:cs="Times New Roman"/>
@@ -7695,7 +7309,7 @@
       </w:pPr>
       <w:r>
         <w:rPr>
-          <w:rStyle w:val="Gl"/>
+          <w:rStyle w:val="Strong"/>
           <w:rFonts w:ascii="Times New Roman" w:eastAsia="Times New Roman" w:hAnsi="Times New Roman" w:cs="Times New Roman"/>
           <w:color w:val="5983B0"/>
           <w:sz w:val="30"/>
@@ -7704,27 +7318,15 @@
         </w:rPr>
         <w:t xml:space="preserve">   </w:t>
       </w:r>
-      <w:proofErr w:type="spellStart"/>
-      <w:r>
-        <w:rPr>
-          <w:rFonts w:ascii="Times New Roman" w:eastAsia="Times New Roman" w:hAnsi="Times New Roman" w:cs="Times New Roman"/>
-          <w:color w:val="000000"/>
-          <w:sz w:val="24"/>
-          <w:szCs w:val="24"/>
-          <w:lang w:val="tr-TR"/>
-        </w:rPr>
-        <w:t>The</w:t>
-      </w:r>
-      <w:proofErr w:type="spellEnd"/>
-      <w:r>
-        <w:rPr>
-          <w:rFonts w:ascii="Times New Roman" w:eastAsia="Times New Roman" w:hAnsi="Times New Roman" w:cs="Times New Roman"/>
-          <w:color w:val="000000"/>
-          <w:sz w:val="24"/>
-          <w:szCs w:val="24"/>
-          <w:lang w:val="tr-TR"/>
-        </w:rPr>
-        <w:t xml:space="preserve"> </w:t>
+      <w:r>
+        <w:rPr>
+          <w:rFonts w:ascii="Times New Roman" w:eastAsia="Times New Roman" w:hAnsi="Times New Roman" w:cs="Times New Roman"/>
+          <w:color w:val="000000"/>
+          <w:sz w:val="24"/>
+          <w:szCs w:val="24"/>
+          <w:lang w:val="tr-TR"/>
+        </w:rPr>
+        <w:t xml:space="preserve">The </w:t>
       </w:r>
       <w:proofErr w:type="spellStart"/>
       <w:r>
@@ -7790,29 +7392,7 @@
           <w:szCs w:val="24"/>
           <w:lang w:val="tr-TR"/>
         </w:rPr>
-        <w:t xml:space="preserve"> of </w:t>
-      </w:r>
-      <w:proofErr w:type="spellStart"/>
-      <w:r>
-        <w:rPr>
-          <w:rFonts w:ascii="Times New Roman" w:eastAsia="Times New Roman" w:hAnsi="Times New Roman" w:cs="Times New Roman"/>
-          <w:color w:val="000000"/>
-          <w:sz w:val="24"/>
-          <w:szCs w:val="24"/>
-          <w:lang w:val="tr-TR"/>
-        </w:rPr>
-        <w:t>the</w:t>
-      </w:r>
-      <w:proofErr w:type="spellEnd"/>
-      <w:r>
-        <w:rPr>
-          <w:rFonts w:ascii="Times New Roman" w:eastAsia="Times New Roman" w:hAnsi="Times New Roman" w:cs="Times New Roman"/>
-          <w:color w:val="000000"/>
-          <w:sz w:val="24"/>
-          <w:szCs w:val="24"/>
-          <w:lang w:val="tr-TR"/>
-        </w:rPr>
-        <w:t xml:space="preserve"> </w:t>
+        <w:t xml:space="preserve"> of the </w:t>
       </w:r>
       <w:proofErr w:type="spellStart"/>
       <w:r>
@@ -8076,29 +7656,7 @@
           <w:szCs w:val="24"/>
           <w:lang w:val="tr-TR"/>
         </w:rPr>
-        <w:t xml:space="preserve"> </w:t>
-      </w:r>
-      <w:proofErr w:type="spellStart"/>
-      <w:r>
-        <w:rPr>
-          <w:rFonts w:ascii="Times New Roman" w:eastAsia="Times New Roman" w:hAnsi="Times New Roman" w:cs="Times New Roman"/>
-          <w:color w:val="000000"/>
-          <w:sz w:val="24"/>
-          <w:szCs w:val="24"/>
-          <w:lang w:val="tr-TR"/>
-        </w:rPr>
-        <w:t>the</w:t>
-      </w:r>
-      <w:proofErr w:type="spellEnd"/>
-      <w:r>
-        <w:rPr>
-          <w:rFonts w:ascii="Times New Roman" w:eastAsia="Times New Roman" w:hAnsi="Times New Roman" w:cs="Times New Roman"/>
-          <w:color w:val="000000"/>
-          <w:sz w:val="24"/>
-          <w:szCs w:val="24"/>
-          <w:lang w:val="tr-TR"/>
-        </w:rPr>
-        <w:t xml:space="preserve"> </w:t>
+        <w:t xml:space="preserve"> the </w:t>
       </w:r>
       <w:proofErr w:type="spellStart"/>
       <w:r>
@@ -8142,34 +7700,12 @@
           <w:szCs w:val="24"/>
           <w:lang w:val="tr-TR"/>
         </w:rPr>
-        <w:t xml:space="preserve"> </w:t>
-      </w:r>
-      <w:proofErr w:type="spellStart"/>
-      <w:r>
-        <w:rPr>
-          <w:rFonts w:ascii="Times New Roman" w:eastAsia="Times New Roman" w:hAnsi="Times New Roman" w:cs="Times New Roman"/>
-          <w:color w:val="000000"/>
-          <w:sz w:val="24"/>
-          <w:szCs w:val="24"/>
-          <w:lang w:val="tr-TR"/>
-        </w:rPr>
-        <w:t>the</w:t>
-      </w:r>
-      <w:proofErr w:type="spellEnd"/>
-      <w:r>
-        <w:rPr>
-          <w:rFonts w:ascii="Times New Roman" w:eastAsia="Times New Roman" w:hAnsi="Times New Roman" w:cs="Times New Roman"/>
-          <w:color w:val="000000"/>
-          <w:sz w:val="24"/>
-          <w:szCs w:val="24"/>
-          <w:lang w:val="tr-TR"/>
-        </w:rPr>
-        <w:t xml:space="preserve"> admin.</w:t>
+        <w:t xml:space="preserve"> the admin.</w:t>
       </w:r>
     </w:p>
     <w:p>
       <w:pPr>
-        <w:pStyle w:val="Balk3"/>
+        <w:pStyle w:val="Heading3"/>
         <w:spacing w:before="240" w:after="240"/>
         <w:rPr>
           <w:rFonts w:ascii="Times New Roman" w:eastAsia="Times New Roman" w:hAnsi="Times New Roman" w:cs="Times New Roman"/>
@@ -8179,7 +7715,7 @@
       </w:pPr>
       <w:r>
         <w:rPr>
-          <w:rStyle w:val="Gl"/>
+          <w:rStyle w:val="Strong"/>
           <w:rFonts w:ascii="Times New Roman" w:eastAsia="Times New Roman" w:hAnsi="Times New Roman" w:cs="Times New Roman"/>
           <w:color w:val="5983B0"/>
           <w:sz w:val="30"/>
@@ -8192,7 +7728,7 @@
       <w:proofErr w:type="spellStart"/>
       <w:r>
         <w:rPr>
-          <w:rStyle w:val="Gl"/>
+          <w:rStyle w:val="Strong"/>
           <w:rFonts w:ascii="Times New Roman" w:eastAsia="Times New Roman" w:hAnsi="Times New Roman" w:cs="Times New Roman"/>
           <w:color w:val="5983B0"/>
           <w:sz w:val="30"/>
@@ -8205,7 +7741,7 @@
       <w:proofErr w:type="spellEnd"/>
       <w:r>
         <w:rPr>
-          <w:rStyle w:val="Gl"/>
+          <w:rStyle w:val="Strong"/>
           <w:rFonts w:ascii="Times New Roman" w:eastAsia="Times New Roman" w:hAnsi="Times New Roman" w:cs="Times New Roman"/>
           <w:color w:val="5983B0"/>
           <w:sz w:val="30"/>
@@ -8218,7 +7754,7 @@
       <w:proofErr w:type="spellStart"/>
       <w:r>
         <w:rPr>
-          <w:rStyle w:val="Gl"/>
+          <w:rStyle w:val="Strong"/>
           <w:rFonts w:ascii="Times New Roman" w:eastAsia="Times New Roman" w:hAnsi="Times New Roman" w:cs="Times New Roman"/>
           <w:color w:val="5983B0"/>
           <w:sz w:val="30"/>
@@ -8231,7 +7767,7 @@
       <w:proofErr w:type="spellEnd"/>
       <w:r>
         <w:rPr>
-          <w:rStyle w:val="Gl"/>
+          <w:rStyle w:val="Strong"/>
           <w:rFonts w:ascii="Times New Roman" w:eastAsia="Times New Roman" w:hAnsi="Times New Roman" w:cs="Times New Roman"/>
           <w:color w:val="5983B0"/>
           <w:sz w:val="30"/>
@@ -8244,7 +7780,7 @@
       <w:proofErr w:type="spellStart"/>
       <w:r>
         <w:rPr>
-          <w:rStyle w:val="Gl"/>
+          <w:rStyle w:val="Strong"/>
           <w:rFonts w:ascii="Times New Roman" w:eastAsia="Times New Roman" w:hAnsi="Times New Roman" w:cs="Times New Roman"/>
           <w:color w:val="5983B0"/>
           <w:sz w:val="30"/>
@@ -8257,7 +7793,7 @@
       <w:proofErr w:type="spellEnd"/>
       <w:r>
         <w:rPr>
-          <w:rStyle w:val="Gl"/>
+          <w:rStyle w:val="Strong"/>
           <w:rFonts w:ascii="Times New Roman" w:eastAsia="Times New Roman" w:hAnsi="Times New Roman" w:cs="Times New Roman"/>
           <w:color w:val="5983B0"/>
           <w:sz w:val="30"/>
@@ -8270,7 +7806,7 @@
       <w:proofErr w:type="spellStart"/>
       <w:r>
         <w:rPr>
-          <w:rStyle w:val="Gl"/>
+          <w:rStyle w:val="Strong"/>
           <w:rFonts w:ascii="Times New Roman" w:eastAsia="Times New Roman" w:hAnsi="Times New Roman" w:cs="Times New Roman"/>
           <w:color w:val="5983B0"/>
           <w:sz w:val="30"/>
@@ -8283,7 +7819,7 @@
       <w:proofErr w:type="spellEnd"/>
       <w:r>
         <w:rPr>
-          <w:rStyle w:val="Gl"/>
+          <w:rStyle w:val="Strong"/>
           <w:rFonts w:ascii="Times New Roman" w:eastAsia="Times New Roman" w:hAnsi="Times New Roman" w:cs="Times New Roman"/>
           <w:color w:val="5983B0"/>
           <w:sz w:val="30"/>
@@ -8296,7 +7832,7 @@
     </w:p>
     <w:p>
       <w:pPr>
-        <w:pStyle w:val="Balk3"/>
+        <w:pStyle w:val="Heading3"/>
         <w:spacing w:before="240" w:after="240"/>
         <w:rPr>
           <w:rFonts w:ascii="Times New Roman" w:eastAsia="Times New Roman" w:hAnsi="Times New Roman" w:cs="Times New Roman"/>
@@ -8308,7 +7844,7 @@
       </w:pPr>
       <w:r>
         <w:rPr>
-          <w:rStyle w:val="Gl"/>
+          <w:rStyle w:val="Strong"/>
           <w:rFonts w:ascii="Times New Roman" w:eastAsia="Times New Roman" w:hAnsi="Times New Roman" w:cs="Times New Roman"/>
           <w:color w:val="5983B0"/>
           <w:sz w:val="30"/>
@@ -8391,51 +7927,7 @@
           <w:szCs w:val="24"/>
           <w:lang w:val="tr-TR"/>
         </w:rPr>
-        <w:t xml:space="preserve"> </w:t>
-      </w:r>
-      <w:proofErr w:type="spellStart"/>
-      <w:r>
-        <w:rPr>
-          <w:rFonts w:ascii="Times New Roman" w:eastAsia="Times New Roman" w:hAnsi="Times New Roman" w:cs="Times New Roman"/>
-          <w:color w:val="000000"/>
-          <w:sz w:val="24"/>
-          <w:szCs w:val="24"/>
-          <w:lang w:val="tr-TR"/>
-        </w:rPr>
-        <w:t>the</w:t>
-      </w:r>
-      <w:proofErr w:type="spellEnd"/>
-      <w:r>
-        <w:rPr>
-          <w:rFonts w:ascii="Times New Roman" w:eastAsia="Times New Roman" w:hAnsi="Times New Roman" w:cs="Times New Roman"/>
-          <w:color w:val="000000"/>
-          <w:sz w:val="24"/>
-          <w:szCs w:val="24"/>
-          <w:lang w:val="tr-TR"/>
-        </w:rPr>
-        <w:t xml:space="preserve"> </w:t>
-      </w:r>
-      <w:proofErr w:type="gramStart"/>
-      <w:r>
-        <w:rPr>
-          <w:rFonts w:ascii="Times New Roman" w:eastAsia="Times New Roman" w:hAnsi="Times New Roman" w:cs="Times New Roman"/>
-          <w:color w:val="000000"/>
-          <w:sz w:val="24"/>
-          <w:szCs w:val="24"/>
-          <w:lang w:val="tr-TR"/>
-        </w:rPr>
-        <w:t>data</w:t>
-      </w:r>
-      <w:proofErr w:type="gramEnd"/>
-      <w:r>
-        <w:rPr>
-          <w:rFonts w:ascii="Times New Roman" w:eastAsia="Times New Roman" w:hAnsi="Times New Roman" w:cs="Times New Roman"/>
-          <w:color w:val="000000"/>
-          <w:sz w:val="24"/>
-          <w:szCs w:val="24"/>
-          <w:lang w:val="tr-TR"/>
-        </w:rPr>
-        <w:t xml:space="preserve"> </w:t>
+        <w:t xml:space="preserve"> the data </w:t>
       </w:r>
       <w:proofErr w:type="spellStart"/>
       <w:r>
@@ -8699,29 +8191,7 @@
           <w:szCs w:val="24"/>
           <w:lang w:val="tr-TR"/>
         </w:rPr>
-        <w:t xml:space="preserve"> </w:t>
-      </w:r>
-      <w:proofErr w:type="spellStart"/>
-      <w:r>
-        <w:rPr>
-          <w:rFonts w:ascii="Times New Roman" w:eastAsia="Times New Roman" w:hAnsi="Times New Roman" w:cs="Times New Roman"/>
-          <w:color w:val="000000"/>
-          <w:sz w:val="24"/>
-          <w:szCs w:val="24"/>
-          <w:lang w:val="tr-TR"/>
-        </w:rPr>
-        <w:t>the</w:t>
-      </w:r>
-      <w:proofErr w:type="spellEnd"/>
-      <w:r>
-        <w:rPr>
-          <w:rFonts w:ascii="Times New Roman" w:eastAsia="Times New Roman" w:hAnsi="Times New Roman" w:cs="Times New Roman"/>
-          <w:color w:val="000000"/>
-          <w:sz w:val="24"/>
-          <w:szCs w:val="24"/>
-          <w:lang w:val="tr-TR"/>
-        </w:rPr>
-        <w:t xml:space="preserve"> </w:t>
+        <w:t xml:space="preserve"> the </w:t>
       </w:r>
       <w:proofErr w:type="spellStart"/>
       <w:r>
@@ -8757,12 +8227,12 @@
     </w:p>
     <w:p>
       <w:pPr>
-        <w:pStyle w:val="Balk3"/>
+        <w:pStyle w:val="Heading3"/>
         <w:keepNext w:val="0"/>
         <w:keepLines w:val="0"/>
         <w:spacing w:before="280"/>
         <w:rPr>
-          <w:rStyle w:val="Gl"/>
+          <w:rStyle w:val="Strong"/>
           <w:rFonts w:ascii="Times New Roman" w:hAnsi="Times New Roman" w:cs="Times New Roman"/>
           <w:color w:val="3465A4"/>
           <w:sz w:val="40"/>
@@ -8772,7 +8242,7 @@
     </w:p>
     <w:p>
       <w:pPr>
-        <w:pStyle w:val="Balk3"/>
+        <w:pStyle w:val="Heading3"/>
         <w:spacing w:before="280"/>
         <w:rPr>
           <w:rFonts w:ascii="Times New Roman" w:eastAsia="Times New Roman" w:hAnsi="Times New Roman" w:cs="Times New Roman"/>
@@ -8782,7 +8252,7 @@
       </w:pPr>
       <w:r>
         <w:rPr>
-          <w:rStyle w:val="Gl"/>
+          <w:rStyle w:val="Strong"/>
           <w:rFonts w:ascii="Times New Roman" w:eastAsia="Times New Roman" w:hAnsi="Times New Roman" w:cs="Times New Roman"/>
           <w:color w:val="3465A4"/>
           <w:sz w:val="40"/>
@@ -8795,7 +8265,7 @@
       <w:proofErr w:type="spellStart"/>
       <w:r>
         <w:rPr>
-          <w:rStyle w:val="Gl"/>
+          <w:rStyle w:val="Strong"/>
           <w:rFonts w:ascii="Times New Roman" w:eastAsia="Times New Roman" w:hAnsi="Times New Roman" w:cs="Times New Roman"/>
           <w:color w:val="3465A4"/>
           <w:sz w:val="40"/>
@@ -8807,7 +8277,7 @@
       <w:proofErr w:type="spellEnd"/>
       <w:r>
         <w:rPr>
-          <w:rStyle w:val="Gl"/>
+          <w:rStyle w:val="Strong"/>
           <w:rFonts w:ascii="Times New Roman" w:eastAsia="Times New Roman" w:hAnsi="Times New Roman" w:cs="Times New Roman"/>
           <w:color w:val="3465A4"/>
           <w:sz w:val="40"/>
@@ -8819,7 +8289,7 @@
       <w:proofErr w:type="spellStart"/>
       <w:r>
         <w:rPr>
-          <w:rStyle w:val="Gl"/>
+          <w:rStyle w:val="Strong"/>
           <w:rFonts w:ascii="Times New Roman" w:eastAsia="Times New Roman" w:hAnsi="Times New Roman" w:cs="Times New Roman"/>
           <w:color w:val="3465A4"/>
           <w:sz w:val="40"/>
@@ -8832,7 +8302,7 @@
     </w:p>
     <w:p>
       <w:pPr>
-        <w:pStyle w:val="Balk3"/>
+        <w:pStyle w:val="Heading3"/>
         <w:spacing w:before="280"/>
         <w:rPr>
           <w:rFonts w:ascii="Times New Roman" w:eastAsia="Times New Roman" w:hAnsi="Times New Roman" w:cs="Times New Roman"/>
@@ -8842,7 +8312,7 @@
       </w:pPr>
       <w:r>
         <w:rPr>
-          <w:rStyle w:val="Gl"/>
+          <w:rStyle w:val="Strong"/>
           <w:rFonts w:ascii="Times New Roman" w:eastAsia="Times New Roman" w:hAnsi="Times New Roman" w:cs="Times New Roman"/>
           <w:color w:val="5983B0"/>
           <w:sz w:val="30"/>
@@ -8855,7 +8325,7 @@
     </w:p>
     <w:p>
       <w:pPr>
-        <w:pStyle w:val="Balk3"/>
+        <w:pStyle w:val="Heading3"/>
         <w:spacing w:before="280"/>
         <w:rPr>
           <w:rFonts w:ascii="Times New Roman" w:eastAsia="Times New Roman" w:hAnsi="Times New Roman" w:cs="Times New Roman"/>
@@ -8867,7 +8337,7 @@
       </w:pPr>
       <w:r>
         <w:rPr>
-          <w:rStyle w:val="Gl"/>
+          <w:rStyle w:val="Strong"/>
           <w:rFonts w:ascii="Times New Roman" w:eastAsia="Times New Roman" w:hAnsi="Times New Roman" w:cs="Times New Roman"/>
           <w:color w:val="5983B0"/>
           <w:sz w:val="30"/>
@@ -8896,29 +8366,7 @@
           <w:szCs w:val="24"/>
           <w:lang w:val="tr-TR"/>
         </w:rPr>
-        <w:t xml:space="preserve"> </w:t>
-      </w:r>
-      <w:proofErr w:type="spellStart"/>
-      <w:r>
-        <w:rPr>
-          <w:rFonts w:ascii="Times New Roman" w:eastAsia="Times New Roman" w:hAnsi="Times New Roman" w:cs="Times New Roman"/>
-          <w:color w:val="000000"/>
-          <w:sz w:val="24"/>
-          <w:szCs w:val="24"/>
-          <w:lang w:val="tr-TR"/>
-        </w:rPr>
-        <w:t>the</w:t>
-      </w:r>
-      <w:proofErr w:type="spellEnd"/>
-      <w:r>
-        <w:rPr>
-          <w:rFonts w:ascii="Times New Roman" w:eastAsia="Times New Roman" w:hAnsi="Times New Roman" w:cs="Times New Roman"/>
-          <w:color w:val="000000"/>
-          <w:sz w:val="24"/>
-          <w:szCs w:val="24"/>
-          <w:lang w:val="tr-TR"/>
-        </w:rPr>
-        <w:t xml:space="preserve"> admin </w:t>
+        <w:t xml:space="preserve"> the admin </w:t>
       </w:r>
       <w:proofErr w:type="spellStart"/>
       <w:r>
@@ -9028,29 +8476,7 @@
           <w:szCs w:val="24"/>
           <w:lang w:val="tr-TR"/>
         </w:rPr>
-        <w:t xml:space="preserve"> </w:t>
-      </w:r>
-      <w:proofErr w:type="spellStart"/>
-      <w:r>
-        <w:rPr>
-          <w:rFonts w:ascii="Times New Roman" w:eastAsia="Times New Roman" w:hAnsi="Times New Roman" w:cs="Times New Roman"/>
-          <w:color w:val="000000"/>
-          <w:sz w:val="24"/>
-          <w:szCs w:val="24"/>
-          <w:lang w:val="tr-TR"/>
-        </w:rPr>
-        <w:t>the</w:t>
-      </w:r>
-      <w:proofErr w:type="spellEnd"/>
-      <w:r>
-        <w:rPr>
-          <w:rFonts w:ascii="Times New Roman" w:eastAsia="Times New Roman" w:hAnsi="Times New Roman" w:cs="Times New Roman"/>
-          <w:color w:val="000000"/>
-          <w:sz w:val="24"/>
-          <w:szCs w:val="24"/>
-          <w:lang w:val="tr-TR"/>
-        </w:rPr>
-        <w:t xml:space="preserve"> </w:t>
+        <w:t xml:space="preserve"> the </w:t>
       </w:r>
       <w:proofErr w:type="spellStart"/>
       <w:r>
@@ -9314,29 +8740,7 @@
           <w:szCs w:val="24"/>
           <w:lang w:val="tr-TR"/>
         </w:rPr>
-        <w:t xml:space="preserve"> </w:t>
-      </w:r>
-      <w:proofErr w:type="spellStart"/>
-      <w:r>
-        <w:rPr>
-          <w:rFonts w:ascii="Times New Roman" w:eastAsia="Times New Roman" w:hAnsi="Times New Roman" w:cs="Times New Roman"/>
-          <w:color w:val="000000"/>
-          <w:sz w:val="24"/>
-          <w:szCs w:val="24"/>
-          <w:lang w:val="tr-TR"/>
-        </w:rPr>
-        <w:t>the</w:t>
-      </w:r>
-      <w:proofErr w:type="spellEnd"/>
-      <w:r>
-        <w:rPr>
-          <w:rFonts w:ascii="Times New Roman" w:eastAsia="Times New Roman" w:hAnsi="Times New Roman" w:cs="Times New Roman"/>
-          <w:color w:val="000000"/>
-          <w:sz w:val="24"/>
-          <w:szCs w:val="24"/>
-          <w:lang w:val="tr-TR"/>
-        </w:rPr>
-        <w:t xml:space="preserve"> </w:t>
+        <w:t xml:space="preserve"> the </w:t>
       </w:r>
       <w:proofErr w:type="spellStart"/>
       <w:r>
@@ -9363,7 +8767,7 @@
     </w:p>
     <w:p>
       <w:pPr>
-        <w:pStyle w:val="Balk3"/>
+        <w:pStyle w:val="Heading3"/>
         <w:spacing w:before="280"/>
         <w:rPr>
           <w:rFonts w:ascii="Times New Roman" w:eastAsia="Times New Roman" w:hAnsi="Times New Roman" w:cs="Times New Roman"/>
@@ -9373,7 +8777,7 @@
       </w:pPr>
       <w:r>
         <w:rPr>
-          <w:rStyle w:val="Gl"/>
+          <w:rStyle w:val="Strong"/>
           <w:rFonts w:ascii="Times New Roman" w:eastAsia="Times New Roman" w:hAnsi="Times New Roman" w:cs="Times New Roman"/>
           <w:color w:val="5983B0"/>
           <w:sz w:val="30"/>
@@ -9386,7 +8790,7 @@
       <w:proofErr w:type="spellStart"/>
       <w:r>
         <w:rPr>
-          <w:rStyle w:val="Gl"/>
+          <w:rStyle w:val="Strong"/>
           <w:rFonts w:ascii="Times New Roman" w:eastAsia="Times New Roman" w:hAnsi="Times New Roman" w:cs="Times New Roman"/>
           <w:color w:val="5983B0"/>
           <w:sz w:val="30"/>
@@ -9399,7 +8803,7 @@
       <w:proofErr w:type="spellEnd"/>
       <w:r>
         <w:rPr>
-          <w:rStyle w:val="Gl"/>
+          <w:rStyle w:val="Strong"/>
           <w:rFonts w:ascii="Times New Roman" w:eastAsia="Times New Roman" w:hAnsi="Times New Roman" w:cs="Times New Roman"/>
           <w:color w:val="5983B0"/>
           <w:sz w:val="30"/>
@@ -9412,7 +8816,7 @@
       <w:proofErr w:type="spellStart"/>
       <w:r>
         <w:rPr>
-          <w:rStyle w:val="Gl"/>
+          <w:rStyle w:val="Strong"/>
           <w:rFonts w:ascii="Times New Roman" w:eastAsia="Times New Roman" w:hAnsi="Times New Roman" w:cs="Times New Roman"/>
           <w:color w:val="5983B0"/>
           <w:sz w:val="30"/>
@@ -9425,7 +8829,7 @@
       <w:proofErr w:type="spellEnd"/>
       <w:r>
         <w:rPr>
-          <w:rStyle w:val="Gl"/>
+          <w:rStyle w:val="Strong"/>
           <w:rFonts w:ascii="Times New Roman" w:eastAsia="Times New Roman" w:hAnsi="Times New Roman" w:cs="Times New Roman"/>
           <w:color w:val="5983B0"/>
           <w:sz w:val="30"/>
@@ -9438,7 +8842,7 @@
       <w:proofErr w:type="spellStart"/>
       <w:r>
         <w:rPr>
-          <w:rStyle w:val="Gl"/>
+          <w:rStyle w:val="Strong"/>
           <w:rFonts w:ascii="Times New Roman" w:eastAsia="Times New Roman" w:hAnsi="Times New Roman" w:cs="Times New Roman"/>
           <w:color w:val="5983B0"/>
           <w:sz w:val="30"/>
@@ -9451,7 +8855,7 @@
       <w:proofErr w:type="spellEnd"/>
       <w:r>
         <w:rPr>
-          <w:rStyle w:val="Gl"/>
+          <w:rStyle w:val="Strong"/>
           <w:rFonts w:ascii="Times New Roman" w:eastAsia="Times New Roman" w:hAnsi="Times New Roman" w:cs="Times New Roman"/>
           <w:color w:val="5983B0"/>
           <w:sz w:val="30"/>
@@ -9464,7 +8868,7 @@
     </w:p>
     <w:p>
       <w:pPr>
-        <w:pStyle w:val="Balk3"/>
+        <w:pStyle w:val="Heading3"/>
         <w:spacing w:before="280"/>
         <w:rPr>
           <w:rFonts w:ascii="Times New Roman" w:eastAsia="Times New Roman" w:hAnsi="Times New Roman" w:cs="Times New Roman"/>
@@ -9476,7 +8880,7 @@
       </w:pPr>
       <w:r>
         <w:rPr>
-          <w:rStyle w:val="Gl"/>
+          <w:rStyle w:val="Strong"/>
           <w:rFonts w:ascii="Times New Roman" w:eastAsia="Times New Roman" w:hAnsi="Times New Roman" w:cs="Times New Roman"/>
           <w:color w:val="5983B0"/>
           <w:sz w:val="30"/>
@@ -9835,29 +9239,7 @@
           <w:szCs w:val="24"/>
           <w:lang w:val="tr-TR"/>
         </w:rPr>
-        <w:t xml:space="preserve">, </w:t>
-      </w:r>
-      <w:proofErr w:type="spellStart"/>
-      <w:r>
-        <w:rPr>
-          <w:rFonts w:ascii="Times New Roman" w:eastAsia="Times New Roman" w:hAnsi="Times New Roman" w:cs="Times New Roman"/>
-          <w:color w:val="000000"/>
-          <w:sz w:val="24"/>
-          <w:szCs w:val="24"/>
-          <w:lang w:val="tr-TR"/>
-        </w:rPr>
-        <w:t>the</w:t>
-      </w:r>
-      <w:proofErr w:type="spellEnd"/>
-      <w:r>
-        <w:rPr>
-          <w:rFonts w:ascii="Times New Roman" w:eastAsia="Times New Roman" w:hAnsi="Times New Roman" w:cs="Times New Roman"/>
-          <w:color w:val="000000"/>
-          <w:sz w:val="24"/>
-          <w:szCs w:val="24"/>
-          <w:lang w:val="tr-TR"/>
-        </w:rPr>
-        <w:t xml:space="preserve"> </w:t>
+        <w:t xml:space="preserve">, the </w:t>
       </w:r>
       <w:proofErr w:type="spellStart"/>
       <w:r>
@@ -9994,7 +9376,7 @@
     </w:p>
     <w:p>
       <w:pPr>
-        <w:pStyle w:val="Balk3"/>
+        <w:pStyle w:val="Heading3"/>
         <w:spacing w:before="280"/>
         <w:rPr>
           <w:rFonts w:ascii="Times New Roman" w:eastAsia="Times New Roman" w:hAnsi="Times New Roman" w:cs="Times New Roman"/>
@@ -10004,7 +9386,7 @@
       </w:pPr>
       <w:r>
         <w:rPr>
-          <w:rStyle w:val="Gl"/>
+          <w:rStyle w:val="Strong"/>
           <w:rFonts w:ascii="Times New Roman" w:eastAsia="Times New Roman" w:hAnsi="Times New Roman" w:cs="Times New Roman"/>
           <w:color w:val="5983B0"/>
           <w:sz w:val="30"/>
@@ -10017,7 +9399,7 @@
       <w:proofErr w:type="spellStart"/>
       <w:r>
         <w:rPr>
-          <w:rStyle w:val="Gl"/>
+          <w:rStyle w:val="Strong"/>
           <w:rFonts w:ascii="Times New Roman" w:eastAsia="Times New Roman" w:hAnsi="Times New Roman" w:cs="Times New Roman"/>
           <w:color w:val="5983B0"/>
           <w:sz w:val="30"/>
@@ -10030,7 +9412,7 @@
       <w:proofErr w:type="spellEnd"/>
       <w:r>
         <w:rPr>
-          <w:rStyle w:val="Gl"/>
+          <w:rStyle w:val="Strong"/>
           <w:rFonts w:ascii="Times New Roman" w:eastAsia="Times New Roman" w:hAnsi="Times New Roman" w:cs="Times New Roman"/>
           <w:color w:val="5983B0"/>
           <w:sz w:val="30"/>
@@ -10043,7 +9425,7 @@
       <w:proofErr w:type="spellStart"/>
       <w:r>
         <w:rPr>
-          <w:rStyle w:val="Gl"/>
+          <w:rStyle w:val="Strong"/>
           <w:rFonts w:ascii="Times New Roman" w:eastAsia="Times New Roman" w:hAnsi="Times New Roman" w:cs="Times New Roman"/>
           <w:color w:val="5983B0"/>
           <w:sz w:val="30"/>
@@ -10056,7 +9438,7 @@
       <w:proofErr w:type="spellEnd"/>
       <w:r>
         <w:rPr>
-          <w:rStyle w:val="Gl"/>
+          <w:rStyle w:val="Strong"/>
           <w:rFonts w:ascii="Times New Roman" w:eastAsia="Times New Roman" w:hAnsi="Times New Roman" w:cs="Times New Roman"/>
           <w:color w:val="5983B0"/>
           <w:sz w:val="30"/>
@@ -10069,7 +9451,7 @@
       <w:proofErr w:type="spellStart"/>
       <w:r>
         <w:rPr>
-          <w:rStyle w:val="Gl"/>
+          <w:rStyle w:val="Strong"/>
           <w:rFonts w:ascii="Times New Roman" w:eastAsia="Times New Roman" w:hAnsi="Times New Roman" w:cs="Times New Roman"/>
           <w:color w:val="5983B0"/>
           <w:sz w:val="30"/>
@@ -10082,7 +9464,7 @@
       <w:proofErr w:type="spellEnd"/>
       <w:r>
         <w:rPr>
-          <w:rStyle w:val="Gl"/>
+          <w:rStyle w:val="Strong"/>
           <w:rFonts w:ascii="Times New Roman" w:eastAsia="Times New Roman" w:hAnsi="Times New Roman" w:cs="Times New Roman"/>
           <w:color w:val="5983B0"/>
           <w:sz w:val="30"/>
@@ -10095,7 +9477,7 @@
       <w:proofErr w:type="spellStart"/>
       <w:r>
         <w:rPr>
-          <w:rStyle w:val="Gl"/>
+          <w:rStyle w:val="Strong"/>
           <w:rFonts w:ascii="Times New Roman" w:eastAsia="Times New Roman" w:hAnsi="Times New Roman" w:cs="Times New Roman"/>
           <w:color w:val="5983B0"/>
           <w:sz w:val="30"/>
@@ -10108,7 +9490,7 @@
       <w:proofErr w:type="spellEnd"/>
       <w:r>
         <w:rPr>
-          <w:rStyle w:val="Gl"/>
+          <w:rStyle w:val="Strong"/>
           <w:rFonts w:ascii="Times New Roman" w:eastAsia="Times New Roman" w:hAnsi="Times New Roman" w:cs="Times New Roman"/>
           <w:color w:val="5983B0"/>
           <w:sz w:val="30"/>
@@ -10121,7 +9503,7 @@
     </w:p>
     <w:p>
       <w:pPr>
-        <w:pStyle w:val="Balk3"/>
+        <w:pStyle w:val="Heading3"/>
         <w:spacing w:before="280"/>
         <w:rPr>
           <w:rFonts w:ascii="Times New Roman" w:eastAsia="Times New Roman" w:hAnsi="Times New Roman" w:cs="Times New Roman"/>
@@ -10133,7 +9515,7 @@
       </w:pPr>
       <w:r>
         <w:rPr>
-          <w:rStyle w:val="Gl"/>
+          <w:rStyle w:val="Strong"/>
           <w:rFonts w:ascii="Times New Roman" w:eastAsia="Times New Roman" w:hAnsi="Times New Roman" w:cs="Times New Roman"/>
           <w:color w:val="5983B0"/>
           <w:sz w:val="30"/>
@@ -10294,29 +9676,7 @@
           <w:szCs w:val="24"/>
           <w:lang w:val="tr-TR"/>
         </w:rPr>
-        <w:t xml:space="preserve"> </w:t>
-      </w:r>
-      <w:proofErr w:type="spellStart"/>
-      <w:r>
-        <w:rPr>
-          <w:rFonts w:ascii="Times New Roman" w:eastAsia="Times New Roman" w:hAnsi="Times New Roman" w:cs="Times New Roman"/>
-          <w:color w:val="000000"/>
-          <w:sz w:val="24"/>
-          <w:szCs w:val="24"/>
-          <w:lang w:val="tr-TR"/>
-        </w:rPr>
-        <w:t>the</w:t>
-      </w:r>
-      <w:proofErr w:type="spellEnd"/>
-      <w:r>
-        <w:rPr>
-          <w:rFonts w:ascii="Times New Roman" w:eastAsia="Times New Roman" w:hAnsi="Times New Roman" w:cs="Times New Roman"/>
-          <w:color w:val="000000"/>
-          <w:sz w:val="24"/>
-          <w:szCs w:val="24"/>
-          <w:lang w:val="tr-TR"/>
-        </w:rPr>
-        <w:t xml:space="preserve"> </w:t>
+        <w:t xml:space="preserve"> the </w:t>
       </w:r>
       <w:proofErr w:type="spellStart"/>
       <w:r>
@@ -10541,7 +9901,7 @@
     </w:p>
     <w:p>
       <w:pPr>
-        <w:pStyle w:val="Balk3"/>
+        <w:pStyle w:val="Heading3"/>
         <w:spacing w:before="280"/>
         <w:rPr>
           <w:rFonts w:ascii="Times New Roman" w:eastAsia="Times New Roman" w:hAnsi="Times New Roman" w:cs="Times New Roman"/>
@@ -10551,7 +9911,7 @@
       </w:pPr>
       <w:r>
         <w:rPr>
-          <w:rStyle w:val="Gl"/>
+          <w:rStyle w:val="Strong"/>
           <w:rFonts w:ascii="Times New Roman" w:eastAsia="Times New Roman" w:hAnsi="Times New Roman" w:cs="Times New Roman"/>
           <w:color w:val="5983B0"/>
           <w:sz w:val="30"/>
@@ -10564,7 +9924,7 @@
       <w:proofErr w:type="spellStart"/>
       <w:r>
         <w:rPr>
-          <w:rStyle w:val="Gl"/>
+          <w:rStyle w:val="Strong"/>
           <w:rFonts w:ascii="Times New Roman" w:eastAsia="Times New Roman" w:hAnsi="Times New Roman" w:cs="Times New Roman"/>
           <w:color w:val="5983B0"/>
           <w:sz w:val="30"/>
@@ -10577,7 +9937,7 @@
       <w:proofErr w:type="spellEnd"/>
       <w:r>
         <w:rPr>
-          <w:rStyle w:val="Gl"/>
+          <w:rStyle w:val="Strong"/>
           <w:rFonts w:ascii="Times New Roman" w:eastAsia="Times New Roman" w:hAnsi="Times New Roman" w:cs="Times New Roman"/>
           <w:color w:val="5983B0"/>
           <w:sz w:val="30"/>
@@ -10590,7 +9950,7 @@
       <w:proofErr w:type="spellStart"/>
       <w:r>
         <w:rPr>
-          <w:rStyle w:val="Gl"/>
+          <w:rStyle w:val="Strong"/>
           <w:rFonts w:ascii="Times New Roman" w:eastAsia="Times New Roman" w:hAnsi="Times New Roman" w:cs="Times New Roman"/>
           <w:color w:val="5983B0"/>
           <w:sz w:val="30"/>
@@ -10603,7 +9963,7 @@
       <w:proofErr w:type="spellEnd"/>
       <w:r>
         <w:rPr>
-          <w:rStyle w:val="Gl"/>
+          <w:rStyle w:val="Strong"/>
           <w:rFonts w:ascii="Times New Roman" w:eastAsia="Times New Roman" w:hAnsi="Times New Roman" w:cs="Times New Roman"/>
           <w:color w:val="5983B0"/>
           <w:sz w:val="30"/>
@@ -10616,7 +9976,7 @@
       <w:proofErr w:type="spellStart"/>
       <w:r>
         <w:rPr>
-          <w:rStyle w:val="Gl"/>
+          <w:rStyle w:val="Strong"/>
           <w:rFonts w:ascii="Times New Roman" w:eastAsia="Times New Roman" w:hAnsi="Times New Roman" w:cs="Times New Roman"/>
           <w:color w:val="5983B0"/>
           <w:sz w:val="30"/>
@@ -10630,7 +9990,7 @@
     </w:p>
     <w:p>
       <w:pPr>
-        <w:pStyle w:val="Balk3"/>
+        <w:pStyle w:val="Heading3"/>
         <w:spacing w:before="280"/>
         <w:rPr>
           <w:rFonts w:ascii="Times New Roman" w:eastAsia="Times New Roman" w:hAnsi="Times New Roman" w:cs="Times New Roman"/>
@@ -10642,7 +10002,7 @@
       </w:pPr>
       <w:r>
         <w:rPr>
-          <w:rStyle w:val="Gl"/>
+          <w:rStyle w:val="Strong"/>
           <w:rFonts w:ascii="Times New Roman" w:eastAsia="Times New Roman" w:hAnsi="Times New Roman" w:cs="Times New Roman"/>
           <w:color w:val="5983B0"/>
           <w:sz w:val="30"/>
@@ -10693,29 +10053,7 @@
           <w:szCs w:val="24"/>
           <w:lang w:val="tr-TR"/>
         </w:rPr>
-        <w:t xml:space="preserve"> </w:t>
-      </w:r>
-      <w:proofErr w:type="spellStart"/>
-      <w:r>
-        <w:rPr>
-          <w:rFonts w:ascii="Times New Roman" w:eastAsia="Times New Roman" w:hAnsi="Times New Roman" w:cs="Times New Roman"/>
-          <w:color w:val="000000"/>
-          <w:sz w:val="24"/>
-          <w:szCs w:val="24"/>
-          <w:lang w:val="tr-TR"/>
-        </w:rPr>
-        <w:t>the</w:t>
-      </w:r>
-      <w:proofErr w:type="spellEnd"/>
-      <w:r>
-        <w:rPr>
-          <w:rFonts w:ascii="Times New Roman" w:eastAsia="Times New Roman" w:hAnsi="Times New Roman" w:cs="Times New Roman"/>
-          <w:color w:val="000000"/>
-          <w:sz w:val="24"/>
-          <w:szCs w:val="24"/>
-          <w:lang w:val="tr-TR"/>
-        </w:rPr>
-        <w:t xml:space="preserve"> </w:t>
+        <w:t xml:space="preserve"> the </w:t>
       </w:r>
       <w:proofErr w:type="spellStart"/>
       <w:r>
@@ -11028,7 +10366,7 @@
     </w:p>
     <w:p>
       <w:pPr>
-        <w:pStyle w:val="Balk3"/>
+        <w:pStyle w:val="Heading3"/>
         <w:spacing w:before="280"/>
         <w:rPr>
           <w:rFonts w:ascii="Times New Roman" w:eastAsia="Times New Roman" w:hAnsi="Times New Roman" w:cs="Times New Roman"/>
@@ -11038,7 +10376,7 @@
       </w:pPr>
       <w:r>
         <w:rPr>
-          <w:rStyle w:val="Gl"/>
+          <w:rStyle w:val="Strong"/>
           <w:rFonts w:ascii="Times New Roman" w:eastAsia="Times New Roman" w:hAnsi="Times New Roman" w:cs="Times New Roman"/>
           <w:color w:val="5983B0"/>
           <w:sz w:val="30"/>
@@ -11051,7 +10389,7 @@
     </w:p>
     <w:p>
       <w:pPr>
-        <w:pStyle w:val="Balk3"/>
+        <w:pStyle w:val="Heading3"/>
         <w:spacing w:before="280"/>
         <w:rPr>
           <w:rFonts w:ascii="Times New Roman" w:eastAsia="Times New Roman" w:hAnsi="Times New Roman" w:cs="Times New Roman"/>
@@ -11063,7 +10401,7 @@
       </w:pPr>
       <w:r>
         <w:rPr>
-          <w:rStyle w:val="Gl"/>
+          <w:rStyle w:val="Strong"/>
           <w:rFonts w:ascii="Times New Roman" w:eastAsia="Times New Roman" w:hAnsi="Times New Roman" w:cs="Times New Roman"/>
           <w:color w:val="5983B0"/>
           <w:sz w:val="30"/>
@@ -11158,29 +10496,7 @@
           <w:szCs w:val="24"/>
           <w:lang w:val="tr-TR"/>
         </w:rPr>
-        <w:t xml:space="preserve"> </w:t>
-      </w:r>
-      <w:proofErr w:type="spellStart"/>
-      <w:r>
-        <w:rPr>
-          <w:rFonts w:ascii="Times New Roman" w:eastAsia="Times New Roman" w:hAnsi="Times New Roman" w:cs="Times New Roman"/>
-          <w:color w:val="000000"/>
-          <w:sz w:val="24"/>
-          <w:szCs w:val="24"/>
-          <w:lang w:val="tr-TR"/>
-        </w:rPr>
-        <w:t>the</w:t>
-      </w:r>
-      <w:proofErr w:type="spellEnd"/>
-      <w:r>
-        <w:rPr>
-          <w:rFonts w:ascii="Times New Roman" w:eastAsia="Times New Roman" w:hAnsi="Times New Roman" w:cs="Times New Roman"/>
-          <w:color w:val="000000"/>
-          <w:sz w:val="24"/>
-          <w:szCs w:val="24"/>
-          <w:lang w:val="tr-TR"/>
-        </w:rPr>
-        <w:t xml:space="preserve"> </w:t>
+        <w:t xml:space="preserve"> the </w:t>
       </w:r>
       <w:proofErr w:type="spellStart"/>
       <w:r>
@@ -11559,9 +10875,9 @@
     </w:p>
     <w:p>
       <w:pPr>
-        <w:pStyle w:val="Balk3"/>
-        <w:rPr>
-          <w:rStyle w:val="Gl"/>
+        <w:pStyle w:val="Heading3"/>
+        <w:rPr>
+          <w:rStyle w:val="Strong"/>
           <w:rFonts w:ascii="Times New Roman" w:hAnsi="Times New Roman" w:cs="Times New Roman"/>
           <w:color w:val="3465A4"/>
           <w:sz w:val="40"/>
@@ -11572,9 +10888,9 @@
     </w:p>
     <w:p>
       <w:pPr>
-        <w:pStyle w:val="Balk3"/>
-        <w:rPr>
-          <w:rStyle w:val="Gl"/>
+        <w:pStyle w:val="Heading3"/>
+        <w:rPr>
+          <w:rStyle w:val="Strong"/>
           <w:rFonts w:ascii="Times New Roman" w:hAnsi="Times New Roman" w:cs="Times New Roman"/>
           <w:color w:val="3465A4"/>
           <w:sz w:val="40"/>
@@ -11585,9 +10901,9 @@
     </w:p>
     <w:p>
       <w:pPr>
-        <w:pStyle w:val="Balk3"/>
-        <w:rPr>
-          <w:rStyle w:val="Gl"/>
+        <w:pStyle w:val="Heading3"/>
+        <w:rPr>
+          <w:rStyle w:val="Strong"/>
           <w:rFonts w:ascii="Times New Roman" w:hAnsi="Times New Roman" w:cs="Times New Roman"/>
           <w:color w:val="3465A4"/>
           <w:sz w:val="40"/>
@@ -11598,9 +10914,9 @@
     </w:p>
     <w:p>
       <w:pPr>
-        <w:pStyle w:val="Balk3"/>
-        <w:rPr>
-          <w:rStyle w:val="Gl"/>
+        <w:pStyle w:val="Heading3"/>
+        <w:rPr>
+          <w:rStyle w:val="Strong"/>
           <w:rFonts w:ascii="Times New Roman" w:hAnsi="Times New Roman" w:cs="Times New Roman"/>
           <w:color w:val="3465A4"/>
           <w:sz w:val="40"/>
@@ -11611,9 +10927,9 @@
     </w:p>
     <w:p>
       <w:pPr>
-        <w:pStyle w:val="Balk3"/>
-        <w:rPr>
-          <w:rStyle w:val="Gl"/>
+        <w:pStyle w:val="Heading3"/>
+        <w:rPr>
+          <w:rStyle w:val="Strong"/>
           <w:rFonts w:ascii="Times New Roman" w:hAnsi="Times New Roman" w:cs="Times New Roman"/>
           <w:color w:val="3465A4"/>
           <w:sz w:val="40"/>
@@ -11624,14 +10940,14 @@
     </w:p>
     <w:p>
       <w:pPr>
-        <w:pStyle w:val="Balk3"/>
-        <w:rPr>
-          <w:rFonts w:ascii="Times New Roman" w:hAnsi="Times New Roman" w:cs="Times New Roman"/>
-        </w:rPr>
-      </w:pPr>
-      <w:r>
-        <w:rPr>
-          <w:rStyle w:val="Gl"/>
+        <w:pStyle w:val="Heading3"/>
+        <w:rPr>
+          <w:rFonts w:ascii="Times New Roman" w:hAnsi="Times New Roman" w:cs="Times New Roman"/>
+        </w:rPr>
+      </w:pPr>
+      <w:r>
+        <w:rPr>
+          <w:rStyle w:val="Strong"/>
           <w:rFonts w:ascii="Times New Roman" w:hAnsi="Times New Roman" w:cs="Times New Roman"/>
           <w:color w:val="3465A4"/>
           <w:sz w:val="40"/>
@@ -11644,7 +10960,7 @@
       <w:proofErr w:type="spellStart"/>
       <w:r>
         <w:rPr>
-          <w:rStyle w:val="Gl"/>
+          <w:rStyle w:val="Strong"/>
           <w:rFonts w:ascii="Times New Roman" w:hAnsi="Times New Roman" w:cs="Times New Roman"/>
           <w:color w:val="3465A4"/>
           <w:sz w:val="40"/>
@@ -11656,7 +10972,7 @@
       <w:proofErr w:type="spellEnd"/>
       <w:r>
         <w:rPr>
-          <w:rStyle w:val="Gl"/>
+          <w:rStyle w:val="Strong"/>
           <w:rFonts w:ascii="Times New Roman" w:hAnsi="Times New Roman" w:cs="Times New Roman"/>
           <w:color w:val="3465A4"/>
           <w:sz w:val="40"/>
@@ -11668,7 +10984,7 @@
       <w:proofErr w:type="spellStart"/>
       <w:r>
         <w:rPr>
-          <w:rStyle w:val="Gl"/>
+          <w:rStyle w:val="Strong"/>
           <w:rFonts w:ascii="Times New Roman" w:hAnsi="Times New Roman" w:cs="Times New Roman"/>
           <w:color w:val="3465A4"/>
           <w:sz w:val="40"/>
@@ -11682,7 +10998,7 @@
     <w:p>
       <w:pPr>
         <w:rPr>
-          <w:rStyle w:val="Gl"/>
+          <w:rStyle w:val="Strong"/>
           <w:rFonts w:ascii="Times New Roman" w:hAnsi="Times New Roman" w:cs="Times New Roman"/>
           <w:color w:val="3465A4"/>
           <w:sz w:val="40"/>
@@ -11693,7 +11009,7 @@
     </w:p>
     <w:p>
       <w:pPr>
-        <w:pStyle w:val="GvdeMetni"/>
+        <w:pStyle w:val="BodyText"/>
         <w:rPr>
           <w:rFonts w:ascii="Times New Roman" w:hAnsi="Times New Roman" w:cs="Times New Roman"/>
           <w:sz w:val="28"/>
@@ -11703,7 +11019,7 @@
       </w:pPr>
       <w:r>
         <w:rPr>
-          <w:rStyle w:val="Gl"/>
+          <w:rStyle w:val="Strong"/>
           <w:rFonts w:ascii="Times New Roman" w:hAnsi="Times New Roman" w:cs="Times New Roman"/>
           <w:color w:val="5983B0"/>
           <w:sz w:val="30"/>
@@ -11716,7 +11032,7 @@
       <w:proofErr w:type="spellStart"/>
       <w:r>
         <w:rPr>
-          <w:rStyle w:val="Gl"/>
+          <w:rStyle w:val="Strong"/>
           <w:rFonts w:ascii="Times New Roman" w:hAnsi="Times New Roman" w:cs="Times New Roman"/>
           <w:color w:val="5983B0"/>
           <w:sz w:val="30"/>
@@ -11730,7 +11046,7 @@
     </w:p>
     <w:p>
       <w:pPr>
-        <w:pStyle w:val="GvdeMetni"/>
+        <w:pStyle w:val="BodyText"/>
         <w:numPr>
           <w:ilvl w:val="0"/>
           <w:numId w:val="20"/>
@@ -11742,25 +11058,14 @@
           <w:lang w:val="tr-TR"/>
         </w:rPr>
       </w:pPr>
-      <w:proofErr w:type="spellStart"/>
-      <w:r>
-        <w:rPr>
-          <w:rFonts w:ascii="Times New Roman" w:hAnsi="Times New Roman" w:cs="Times New Roman"/>
-          <w:sz w:val="24"/>
-          <w:szCs w:val="24"/>
-          <w:lang w:val="tr-TR"/>
-        </w:rPr>
-        <w:t>The</w:t>
-      </w:r>
-      <w:proofErr w:type="spellEnd"/>
-      <w:r>
-        <w:rPr>
-          <w:rFonts w:ascii="Times New Roman" w:hAnsi="Times New Roman" w:cs="Times New Roman"/>
-          <w:sz w:val="24"/>
-          <w:szCs w:val="24"/>
-          <w:lang w:val="tr-TR"/>
-        </w:rPr>
-        <w:t xml:space="preserve"> </w:t>
+      <w:r>
+        <w:rPr>
+          <w:rFonts w:ascii="Times New Roman" w:hAnsi="Times New Roman" w:cs="Times New Roman"/>
+          <w:sz w:val="24"/>
+          <w:szCs w:val="24"/>
+          <w:lang w:val="tr-TR"/>
+        </w:rPr>
+        <w:t xml:space="preserve">The </w:t>
       </w:r>
       <w:proofErr w:type="spellStart"/>
       <w:r>
@@ -11865,7 +11170,7 @@
     </w:p>
     <w:p>
       <w:pPr>
-        <w:pStyle w:val="GvdeMetni"/>
+        <w:pStyle w:val="BodyText"/>
         <w:numPr>
           <w:ilvl w:val="0"/>
           <w:numId w:val="20"/>
@@ -11877,25 +11182,14 @@
           <w:lang w:val="tr-TR"/>
         </w:rPr>
       </w:pPr>
-      <w:proofErr w:type="gramStart"/>
-      <w:r>
-        <w:rPr>
-          <w:rFonts w:ascii="Times New Roman" w:hAnsi="Times New Roman" w:cs="Times New Roman"/>
-          <w:sz w:val="24"/>
-          <w:szCs w:val="24"/>
-          <w:lang w:val="tr-TR"/>
-        </w:rPr>
-        <w:t>Software</w:t>
-      </w:r>
-      <w:proofErr w:type="gramEnd"/>
-      <w:r>
-        <w:rPr>
-          <w:rFonts w:ascii="Times New Roman" w:hAnsi="Times New Roman" w:cs="Times New Roman"/>
-          <w:sz w:val="24"/>
-          <w:szCs w:val="24"/>
-          <w:lang w:val="tr-TR"/>
-        </w:rPr>
-        <w:t xml:space="preserve"> </w:t>
+      <w:r>
+        <w:rPr>
+          <w:rFonts w:ascii="Times New Roman" w:hAnsi="Times New Roman" w:cs="Times New Roman"/>
+          <w:sz w:val="24"/>
+          <w:szCs w:val="24"/>
+          <w:lang w:val="tr-TR"/>
+        </w:rPr>
+        <w:t xml:space="preserve">Software </w:t>
       </w:r>
       <w:proofErr w:type="spellStart"/>
       <w:r>
@@ -12013,20 +11307,9 @@
           <w:szCs w:val="24"/>
           <w:lang w:val="tr-TR"/>
         </w:rPr>
-        <w:t xml:space="preserve"> </w:t>
-      </w:r>
-      <w:proofErr w:type="gramStart"/>
-      <w:r>
-        <w:rPr>
-          <w:rFonts w:ascii="Times New Roman" w:hAnsi="Times New Roman" w:cs="Times New Roman"/>
-          <w:sz w:val="24"/>
-          <w:szCs w:val="24"/>
-          <w:lang w:val="tr-TR"/>
-        </w:rPr>
-        <w:t>Python(</w:t>
-      </w:r>
-      <w:proofErr w:type="spellStart"/>
-      <w:proofErr w:type="gramEnd"/>
+        <w:t xml:space="preserve"> Python(</w:t>
+      </w:r>
+      <w:proofErr w:type="spellStart"/>
       <w:r>
         <w:rPr>
           <w:rFonts w:ascii="Times New Roman" w:hAnsi="Times New Roman" w:cs="Times New Roman"/>
@@ -12064,17 +11347,7 @@
           <w:szCs w:val="24"/>
           <w:lang w:val="tr-TR"/>
         </w:rPr>
-        <w:t xml:space="preserve"> Java/</w:t>
-      </w:r>
-      <w:proofErr w:type="gramStart"/>
-      <w:r>
-        <w:rPr>
-          <w:rFonts w:ascii="Times New Roman" w:hAnsi="Times New Roman" w:cs="Times New Roman"/>
-          <w:sz w:val="24"/>
-          <w:szCs w:val="24"/>
-          <w:lang w:val="tr-TR"/>
-        </w:rPr>
-        <w:t xml:space="preserve">Spring  </w:t>
+        <w:t xml:space="preserve"> Java/Spring  </w:t>
       </w:r>
       <w:proofErr w:type="spellStart"/>
       <w:r>
@@ -12087,7 +11360,6 @@
         <w:t>Boot</w:t>
       </w:r>
       <w:proofErr w:type="spellEnd"/>
-      <w:proofErr w:type="gramEnd"/>
       <w:r>
         <w:rPr>
           <w:rFonts w:ascii="Times New Roman" w:hAnsi="Times New Roman" w:cs="Times New Roman"/>
@@ -12100,7 +11372,7 @@
     </w:p>
     <w:p>
       <w:pPr>
-        <w:pStyle w:val="GvdeMetni"/>
+        <w:pStyle w:val="BodyText"/>
         <w:numPr>
           <w:ilvl w:val="0"/>
           <w:numId w:val="20"/>
@@ -12179,27 +11451,7 @@
           <w:szCs w:val="24"/>
           <w:lang w:val="tr-TR"/>
         </w:rPr>
-        <w:t xml:space="preserve"> of </w:t>
-      </w:r>
-      <w:proofErr w:type="spellStart"/>
-      <w:r>
-        <w:rPr>
-          <w:rFonts w:ascii="Times New Roman" w:hAnsi="Times New Roman" w:cs="Times New Roman"/>
-          <w:sz w:val="24"/>
-          <w:szCs w:val="24"/>
-          <w:lang w:val="tr-TR"/>
-        </w:rPr>
-        <w:t>the</w:t>
-      </w:r>
-      <w:proofErr w:type="spellEnd"/>
-      <w:r>
-        <w:rPr>
-          <w:rFonts w:ascii="Times New Roman" w:hAnsi="Times New Roman" w:cs="Times New Roman"/>
-          <w:sz w:val="24"/>
-          <w:szCs w:val="24"/>
-          <w:lang w:val="tr-TR"/>
-        </w:rPr>
-        <w:t xml:space="preserve"> </w:t>
+        <w:t xml:space="preserve"> of the </w:t>
       </w:r>
       <w:proofErr w:type="spellStart"/>
       <w:r>
@@ -12284,7 +11536,7 @@
     </w:p>
     <w:p>
       <w:pPr>
-        <w:pStyle w:val="GvdeMetni"/>
+        <w:pStyle w:val="BodyText"/>
         <w:rPr>
           <w:rFonts w:ascii="Times New Roman" w:hAnsi="Times New Roman" w:cs="Times New Roman"/>
           <w:sz w:val="24"/>
@@ -12313,7 +11565,7 @@
       </w:r>
       <w:r>
         <w:rPr>
-          <w:rStyle w:val="Gl"/>
+          <w:rStyle w:val="Strong"/>
           <w:rFonts w:ascii="Times New Roman" w:hAnsi="Times New Roman" w:cs="Times New Roman"/>
           <w:color w:val="5983B0"/>
           <w:sz w:val="30"/>
@@ -12326,17 +11578,17 @@
     </w:p>
     <w:p>
       <w:pPr>
-        <w:pStyle w:val="GvdeMetni"/>
-        <w:rPr>
-          <w:rFonts w:ascii="Times New Roman" w:hAnsi="Times New Roman" w:cs="Times New Roman"/>
-          <w:sz w:val="24"/>
-          <w:szCs w:val="24"/>
-          <w:lang w:val="tr-TR"/>
-        </w:rPr>
-      </w:pPr>
-      <w:r>
-        <w:rPr>
-          <w:rStyle w:val="Gl"/>
+        <w:pStyle w:val="BodyText"/>
+        <w:rPr>
+          <w:rFonts w:ascii="Times New Roman" w:hAnsi="Times New Roman" w:cs="Times New Roman"/>
+          <w:sz w:val="24"/>
+          <w:szCs w:val="24"/>
+          <w:lang w:val="tr-TR"/>
+        </w:rPr>
+      </w:pPr>
+      <w:r>
+        <w:rPr>
+          <w:rStyle w:val="Strong"/>
           <w:rFonts w:ascii="Times New Roman" w:hAnsi="Times New Roman" w:cs="Times New Roman"/>
           <w:color w:val="5983B0"/>
           <w:sz w:val="30"/>
@@ -12352,27 +11604,7 @@
           <w:szCs w:val="24"/>
           <w:lang w:val="tr-TR"/>
         </w:rPr>
-        <w:t xml:space="preserve">Since </w:t>
-      </w:r>
-      <w:proofErr w:type="spellStart"/>
-      <w:r>
-        <w:rPr>
-          <w:rFonts w:ascii="Times New Roman" w:hAnsi="Times New Roman" w:cs="Times New Roman"/>
-          <w:sz w:val="24"/>
-          <w:szCs w:val="24"/>
-          <w:lang w:val="tr-TR"/>
-        </w:rPr>
-        <w:t>the</w:t>
-      </w:r>
-      <w:proofErr w:type="spellEnd"/>
-      <w:r>
-        <w:rPr>
-          <w:rFonts w:ascii="Times New Roman" w:hAnsi="Times New Roman" w:cs="Times New Roman"/>
-          <w:sz w:val="24"/>
-          <w:szCs w:val="24"/>
-          <w:lang w:val="tr-TR"/>
-        </w:rPr>
-        <w:t xml:space="preserve"> </w:t>
+        <w:t xml:space="preserve">Since the </w:t>
       </w:r>
       <w:proofErr w:type="spellStart"/>
       <w:r>
@@ -12492,27 +11724,7 @@
           <w:szCs w:val="24"/>
           <w:lang w:val="tr-TR"/>
         </w:rPr>
-        <w:t xml:space="preserve"> </w:t>
-      </w:r>
-      <w:proofErr w:type="gramStart"/>
-      <w:r>
-        <w:rPr>
-          <w:rFonts w:ascii="Times New Roman" w:hAnsi="Times New Roman" w:cs="Times New Roman"/>
-          <w:sz w:val="24"/>
-          <w:szCs w:val="24"/>
-          <w:lang w:val="tr-TR"/>
-        </w:rPr>
-        <w:t>software</w:t>
-      </w:r>
-      <w:proofErr w:type="gramEnd"/>
-      <w:r>
-        <w:rPr>
-          <w:rFonts w:ascii="Times New Roman" w:hAnsi="Times New Roman" w:cs="Times New Roman"/>
-          <w:sz w:val="24"/>
-          <w:szCs w:val="24"/>
-          <w:lang w:val="tr-TR"/>
-        </w:rPr>
-        <w:t xml:space="preserve"> </w:t>
+        <w:t xml:space="preserve"> software </w:t>
       </w:r>
       <w:proofErr w:type="spellStart"/>
       <w:r>
@@ -12592,27 +11804,7 @@
           <w:szCs w:val="24"/>
           <w:lang w:val="tr-TR"/>
         </w:rPr>
-        <w:t xml:space="preserve"> </w:t>
-      </w:r>
-      <w:proofErr w:type="gramStart"/>
-      <w:r>
-        <w:rPr>
-          <w:rFonts w:ascii="Times New Roman" w:hAnsi="Times New Roman" w:cs="Times New Roman"/>
-          <w:sz w:val="24"/>
-          <w:szCs w:val="24"/>
-          <w:lang w:val="tr-TR"/>
-        </w:rPr>
-        <w:t>software</w:t>
-      </w:r>
-      <w:proofErr w:type="gramEnd"/>
-      <w:r>
-        <w:rPr>
-          <w:rFonts w:ascii="Times New Roman" w:hAnsi="Times New Roman" w:cs="Times New Roman"/>
-          <w:sz w:val="24"/>
-          <w:szCs w:val="24"/>
-          <w:lang w:val="tr-TR"/>
-        </w:rPr>
-        <w:t xml:space="preserve"> </w:t>
+        <w:t xml:space="preserve"> software </w:t>
       </w:r>
       <w:proofErr w:type="spellStart"/>
       <w:r>
@@ -12911,15 +12103,15 @@
     </w:p>
     <w:p>
       <w:pPr>
-        <w:pStyle w:val="Balk3"/>
-        <w:rPr>
-          <w:rFonts w:ascii="Times New Roman" w:hAnsi="Times New Roman" w:cs="Times New Roman"/>
-          <w:lang w:val="tr-TR"/>
-        </w:rPr>
-      </w:pPr>
-      <w:r>
-        <w:rPr>
-          <w:rStyle w:val="Gl"/>
+        <w:pStyle w:val="Heading3"/>
+        <w:rPr>
+          <w:rFonts w:ascii="Times New Roman" w:hAnsi="Times New Roman" w:cs="Times New Roman"/>
+          <w:lang w:val="tr-TR"/>
+        </w:rPr>
+      </w:pPr>
+      <w:r>
+        <w:rPr>
+          <w:rStyle w:val="Strong"/>
           <w:rFonts w:ascii="Times New Roman" w:hAnsi="Times New Roman" w:cs="Times New Roman"/>
           <w:color w:val="3465A4"/>
           <w:sz w:val="40"/>
@@ -12931,7 +12123,7 @@
       <w:proofErr w:type="spellStart"/>
       <w:r>
         <w:rPr>
-          <w:rStyle w:val="Gl"/>
+          <w:rStyle w:val="Strong"/>
           <w:rFonts w:ascii="Times New Roman" w:hAnsi="Times New Roman" w:cs="Times New Roman"/>
           <w:color w:val="3465A4"/>
           <w:sz w:val="40"/>
@@ -12943,7 +12135,7 @@
       <w:proofErr w:type="spellEnd"/>
       <w:r>
         <w:rPr>
-          <w:rStyle w:val="Gl"/>
+          <w:rStyle w:val="Strong"/>
           <w:rFonts w:ascii="Times New Roman" w:hAnsi="Times New Roman" w:cs="Times New Roman"/>
           <w:color w:val="3465A4"/>
           <w:sz w:val="40"/>
@@ -12955,7 +12147,7 @@
       <w:proofErr w:type="spellStart"/>
       <w:r>
         <w:rPr>
-          <w:rStyle w:val="Gl"/>
+          <w:rStyle w:val="Strong"/>
           <w:rFonts w:ascii="Times New Roman" w:hAnsi="Times New Roman" w:cs="Times New Roman"/>
           <w:color w:val="3465A4"/>
           <w:sz w:val="40"/>
@@ -12968,7 +12160,7 @@
     </w:p>
     <w:p>
       <w:pPr>
-        <w:pStyle w:val="GvdeMetni"/>
+        <w:pStyle w:val="BodyText"/>
         <w:numPr>
           <w:ilvl w:val="0"/>
           <w:numId w:val="6"/>
@@ -13307,7 +12499,7 @@
     </w:p>
     <w:p>
       <w:pPr>
-        <w:pStyle w:val="GvdeMetni"/>
+        <w:pStyle w:val="BodyText"/>
         <w:numPr>
           <w:ilvl w:val="0"/>
           <w:numId w:val="6"/>
@@ -13323,25 +12515,14 @@
           <w:lang w:val="tr-TR"/>
         </w:rPr>
       </w:pPr>
-      <w:proofErr w:type="spellStart"/>
-      <w:r>
-        <w:rPr>
-          <w:rFonts w:ascii="Times New Roman" w:hAnsi="Times New Roman" w:cs="Times New Roman"/>
-          <w:sz w:val="24"/>
-          <w:szCs w:val="24"/>
-          <w:lang w:val="tr-TR"/>
-        </w:rPr>
-        <w:t>The</w:t>
-      </w:r>
-      <w:proofErr w:type="spellEnd"/>
-      <w:r>
-        <w:rPr>
-          <w:rFonts w:ascii="Times New Roman" w:hAnsi="Times New Roman" w:cs="Times New Roman"/>
-          <w:sz w:val="24"/>
-          <w:szCs w:val="24"/>
-          <w:lang w:val="tr-TR"/>
-        </w:rPr>
-        <w:t xml:space="preserve"> </w:t>
+      <w:r>
+        <w:rPr>
+          <w:rFonts w:ascii="Times New Roman" w:hAnsi="Times New Roman" w:cs="Times New Roman"/>
+          <w:sz w:val="24"/>
+          <w:szCs w:val="24"/>
+          <w:lang w:val="tr-TR"/>
+        </w:rPr>
+        <w:t xml:space="preserve">The </w:t>
       </w:r>
       <w:proofErr w:type="spellStart"/>
       <w:r>
@@ -13481,27 +12662,7 @@
           <w:szCs w:val="24"/>
           <w:lang w:val="tr-TR"/>
         </w:rPr>
-        <w:t xml:space="preserve"> </w:t>
-      </w:r>
-      <w:proofErr w:type="spellStart"/>
-      <w:r>
-        <w:rPr>
-          <w:rFonts w:ascii="Times New Roman" w:hAnsi="Times New Roman" w:cs="Times New Roman"/>
-          <w:sz w:val="24"/>
-          <w:szCs w:val="24"/>
-          <w:lang w:val="tr-TR"/>
-        </w:rPr>
-        <w:t>the</w:t>
-      </w:r>
-      <w:proofErr w:type="spellEnd"/>
-      <w:r>
-        <w:rPr>
-          <w:rFonts w:ascii="Times New Roman" w:hAnsi="Times New Roman" w:cs="Times New Roman"/>
-          <w:sz w:val="24"/>
-          <w:szCs w:val="24"/>
-          <w:lang w:val="tr-TR"/>
-        </w:rPr>
-        <w:t xml:space="preserve"> </w:t>
+        <w:t xml:space="preserve"> the </w:t>
       </w:r>
       <w:proofErr w:type="spellStart"/>
       <w:r>
@@ -13546,7 +12707,7 @@
       <w:proofErr w:type="spellStart"/>
       <w:r>
         <w:rPr>
-          <w:rStyle w:val="Gl"/>
+          <w:rStyle w:val="Strong"/>
           <w:rFonts w:ascii="Times New Roman" w:hAnsi="Times New Roman" w:cs="Times New Roman"/>
           <w:b w:val="0"/>
           <w:bCs w:val="0"/>
@@ -13559,7 +12720,7 @@
       <w:proofErr w:type="spellEnd"/>
       <w:r>
         <w:rPr>
-          <w:rStyle w:val="Gl"/>
+          <w:rStyle w:val="Strong"/>
           <w:rFonts w:ascii="Times New Roman" w:hAnsi="Times New Roman" w:cs="Times New Roman"/>
           <w:b w:val="0"/>
           <w:bCs w:val="0"/>
@@ -13572,7 +12733,7 @@
       <w:proofErr w:type="spellStart"/>
       <w:r>
         <w:rPr>
-          <w:rStyle w:val="Gl"/>
+          <w:rStyle w:val="Strong"/>
           <w:rFonts w:ascii="Times New Roman" w:hAnsi="Times New Roman" w:cs="Times New Roman"/>
           <w:b w:val="0"/>
           <w:bCs w:val="0"/>
@@ -13585,7 +12746,7 @@
       <w:proofErr w:type="spellEnd"/>
       <w:r>
         <w:rPr>
-          <w:rStyle w:val="Gl"/>
+          <w:rStyle w:val="Strong"/>
           <w:rFonts w:ascii="Times New Roman" w:hAnsi="Times New Roman" w:cs="Times New Roman"/>
           <w:b w:val="0"/>
           <w:bCs w:val="0"/>
@@ -13598,7 +12759,7 @@
       <w:proofErr w:type="spellStart"/>
       <w:r>
         <w:rPr>
-          <w:rStyle w:val="Gl"/>
+          <w:rStyle w:val="Strong"/>
           <w:rFonts w:ascii="Times New Roman" w:hAnsi="Times New Roman" w:cs="Times New Roman"/>
           <w:b w:val="0"/>
           <w:bCs w:val="0"/>
@@ -13611,7 +12772,7 @@
       <w:proofErr w:type="spellEnd"/>
       <w:r>
         <w:rPr>
-          <w:rStyle w:val="Gl"/>
+          <w:rStyle w:val="Strong"/>
           <w:rFonts w:ascii="Times New Roman" w:hAnsi="Times New Roman" w:cs="Times New Roman"/>
           <w:b w:val="0"/>
           <w:bCs w:val="0"/>
@@ -13623,7 +12784,7 @@
       </w:r>
       <w:r>
         <w:rPr>
-          <w:rStyle w:val="Gl"/>
+          <w:rStyle w:val="Strong"/>
           <w:rFonts w:ascii="Times New Roman" w:hAnsi="Times New Roman" w:cs="Times New Roman"/>
           <w:b w:val="0"/>
           <w:bCs w:val="0"/>
@@ -13635,7 +12796,7 @@
       </w:r>
       <w:r>
         <w:rPr>
-          <w:rStyle w:val="Gl"/>
+          <w:rStyle w:val="Strong"/>
           <w:rFonts w:ascii="Times New Roman" w:hAnsi="Times New Roman" w:cs="Times New Roman"/>
           <w:b w:val="0"/>
           <w:bCs w:val="0"/>
@@ -13648,7 +12809,7 @@
       <w:proofErr w:type="spellStart"/>
       <w:r>
         <w:rPr>
-          <w:rStyle w:val="Gl"/>
+          <w:rStyle w:val="Strong"/>
           <w:rFonts w:ascii="Times New Roman" w:hAnsi="Times New Roman" w:cs="Times New Roman"/>
           <w:b w:val="0"/>
           <w:bCs w:val="0"/>
@@ -13770,7 +12931,7 @@
       </w:r>
       <w:r>
         <w:rPr>
-          <w:rStyle w:val="Gl"/>
+          <w:rStyle w:val="Strong"/>
           <w:rFonts w:ascii="Times New Roman" w:hAnsi="Times New Roman" w:cs="Times New Roman"/>
           <w:b w:val="0"/>
           <w:bCs w:val="0"/>
@@ -13778,12 +12939,11 @@
           <w:szCs w:val="24"/>
           <w:lang w:val="tr-TR"/>
         </w:rPr>
-        <w:t xml:space="preserve">1000 </w:t>
-      </w:r>
-      <w:proofErr w:type="spellStart"/>
-      <w:r>
-        <w:rPr>
-          <w:rStyle w:val="Gl"/>
+        <w:t>200</w:t>
+      </w:r>
+      <w:r>
+        <w:rPr>
+          <w:rStyle w:val="Strong"/>
           <w:rFonts w:ascii="Times New Roman" w:hAnsi="Times New Roman" w:cs="Times New Roman"/>
           <w:b w:val="0"/>
           <w:bCs w:val="0"/>
@@ -13791,6 +12951,19 @@
           <w:szCs w:val="24"/>
           <w:lang w:val="tr-TR"/>
         </w:rPr>
+        <w:t xml:space="preserve"> </w:t>
+      </w:r>
+      <w:proofErr w:type="spellStart"/>
+      <w:r>
+        <w:rPr>
+          <w:rStyle w:val="Strong"/>
+          <w:rFonts w:ascii="Times New Roman" w:hAnsi="Times New Roman" w:cs="Times New Roman"/>
+          <w:b w:val="0"/>
+          <w:bCs w:val="0"/>
+          <w:sz w:val="24"/>
+          <w:szCs w:val="24"/>
+          <w:lang w:val="tr-TR"/>
+        </w:rPr>
         <w:t>books</w:t>
       </w:r>
       <w:proofErr w:type="spellEnd"/>
@@ -13806,7 +12979,7 @@
     </w:p>
     <w:p>
       <w:pPr>
-        <w:pStyle w:val="GvdeMetni"/>
+        <w:pStyle w:val="BodyText"/>
         <w:numPr>
           <w:ilvl w:val="0"/>
           <w:numId w:val="6"/>
@@ -13869,31 +13042,11 @@
           <w:szCs w:val="24"/>
           <w:lang w:val="tr-TR"/>
         </w:rPr>
-        <w:t xml:space="preserve"> </w:t>
-      </w:r>
-      <w:proofErr w:type="spellStart"/>
-      <w:r>
-        <w:rPr>
-          <w:rFonts w:ascii="Times New Roman" w:hAnsi="Times New Roman" w:cs="Times New Roman"/>
-          <w:sz w:val="24"/>
-          <w:szCs w:val="24"/>
-          <w:lang w:val="tr-TR"/>
-        </w:rPr>
-        <w:t>the</w:t>
-      </w:r>
-      <w:proofErr w:type="spellEnd"/>
-      <w:r>
-        <w:rPr>
-          <w:rFonts w:ascii="Times New Roman" w:hAnsi="Times New Roman" w:cs="Times New Roman"/>
-          <w:sz w:val="24"/>
-          <w:szCs w:val="24"/>
-          <w:lang w:val="tr-TR"/>
-        </w:rPr>
-        <w:t xml:space="preserve"> </w:t>
-      </w:r>
-      <w:r>
-        <w:rPr>
-          <w:rStyle w:val="Gl"/>
+        <w:t xml:space="preserve"> the </w:t>
+      </w:r>
+      <w:r>
+        <w:rPr>
+          <w:rStyle w:val="Strong"/>
           <w:rFonts w:ascii="Times New Roman" w:hAnsi="Times New Roman" w:cs="Times New Roman"/>
           <w:b w:val="0"/>
           <w:bCs w:val="0"/>
@@ -14070,27 +13223,7 @@
           <w:szCs w:val="24"/>
           <w:lang w:val="tr-TR"/>
         </w:rPr>
-        <w:t xml:space="preserve"> </w:t>
-      </w:r>
-      <w:proofErr w:type="spellStart"/>
-      <w:r>
-        <w:rPr>
-          <w:rFonts w:ascii="Times New Roman" w:hAnsi="Times New Roman" w:cs="Times New Roman"/>
-          <w:sz w:val="24"/>
-          <w:szCs w:val="24"/>
-          <w:lang w:val="tr-TR"/>
-        </w:rPr>
-        <w:t>the</w:t>
-      </w:r>
-      <w:proofErr w:type="spellEnd"/>
-      <w:r>
-        <w:rPr>
-          <w:rFonts w:ascii="Times New Roman" w:hAnsi="Times New Roman" w:cs="Times New Roman"/>
-          <w:sz w:val="24"/>
-          <w:szCs w:val="24"/>
-          <w:lang w:val="tr-TR"/>
-        </w:rPr>
-        <w:t xml:space="preserve"> </w:t>
+        <w:t xml:space="preserve"> the </w:t>
       </w:r>
       <w:proofErr w:type="spellStart"/>
       <w:r>
@@ -14115,7 +13248,7 @@
       <w:proofErr w:type="spellStart"/>
       <w:r>
         <w:rPr>
-          <w:rStyle w:val="Gl"/>
+          <w:rStyle w:val="Strong"/>
           <w:rFonts w:ascii="Times New Roman" w:hAnsi="Times New Roman" w:cs="Times New Roman"/>
           <w:b w:val="0"/>
           <w:bCs w:val="0"/>
@@ -14128,7 +13261,7 @@
       <w:proofErr w:type="spellEnd"/>
       <w:r>
         <w:rPr>
-          <w:rStyle w:val="Gl"/>
+          <w:rStyle w:val="Strong"/>
           <w:rFonts w:ascii="Times New Roman" w:hAnsi="Times New Roman" w:cs="Times New Roman"/>
           <w:b w:val="0"/>
           <w:bCs w:val="0"/>
@@ -14141,7 +13274,7 @@
       <w:proofErr w:type="spellStart"/>
       <w:r>
         <w:rPr>
-          <w:rStyle w:val="Gl"/>
+          <w:rStyle w:val="Strong"/>
           <w:rFonts w:ascii="Times New Roman" w:hAnsi="Times New Roman" w:cs="Times New Roman"/>
           <w:b w:val="0"/>
           <w:bCs w:val="0"/>
@@ -14154,7 +13287,7 @@
       <w:proofErr w:type="spellEnd"/>
       <w:r>
         <w:rPr>
-          <w:rStyle w:val="Gl"/>
+          <w:rStyle w:val="Strong"/>
           <w:rFonts w:ascii="Times New Roman" w:hAnsi="Times New Roman" w:cs="Times New Roman"/>
           <w:b w:val="0"/>
           <w:bCs w:val="0"/>
@@ -14167,7 +13300,7 @@
       <w:proofErr w:type="spellStart"/>
       <w:r>
         <w:rPr>
-          <w:rStyle w:val="Gl"/>
+          <w:rStyle w:val="Strong"/>
           <w:rFonts w:ascii="Times New Roman" w:hAnsi="Times New Roman" w:cs="Times New Roman"/>
           <w:b w:val="0"/>
           <w:bCs w:val="0"/>
@@ -14291,7 +13424,7 @@
     </w:p>
     <w:tbl>
       <w:tblPr>
-        <w:tblStyle w:val="DzTablo1"/>
+        <w:tblStyle w:val="PlainTable1"/>
         <w:tblW w:w="10201" w:type="dxa"/>
         <w:tblLayout w:type="fixed"/>
         <w:tblLook w:val="04A0" w:firstRow="1" w:lastRow="0" w:firstColumn="1" w:lastColumn="0" w:noHBand="0" w:noVBand="1"/>
@@ -18984,7 +18117,7 @@
       <w:spacing w:line="276" w:lineRule="auto"/>
     </w:pPr>
   </w:style>
-  <w:style w:type="paragraph" w:styleId="Balk1">
+  <w:style w:type="paragraph" w:styleId="Heading1">
     <w:name w:val="heading 1"/>
     <w:basedOn w:val="Normal"/>
     <w:next w:val="Normal"/>
@@ -19001,7 +18134,7 @@
       <w:szCs w:val="40"/>
     </w:rPr>
   </w:style>
-  <w:style w:type="paragraph" w:styleId="Balk2">
+  <w:style w:type="paragraph" w:styleId="Heading2">
     <w:name w:val="heading 2"/>
     <w:basedOn w:val="Normal"/>
     <w:next w:val="Normal"/>
@@ -19019,7 +18152,7 @@
       <w:szCs w:val="32"/>
     </w:rPr>
   </w:style>
-  <w:style w:type="paragraph" w:styleId="Balk3">
+  <w:style w:type="paragraph" w:styleId="Heading3">
     <w:name w:val="heading 3"/>
     <w:basedOn w:val="Normal"/>
     <w:next w:val="Normal"/>
@@ -19038,7 +18171,7 @@
       <w:szCs w:val="28"/>
     </w:rPr>
   </w:style>
-  <w:style w:type="paragraph" w:styleId="Balk4">
+  <w:style w:type="paragraph" w:styleId="Heading4">
     <w:name w:val="heading 4"/>
     <w:basedOn w:val="Normal"/>
     <w:next w:val="Normal"/>
@@ -19058,7 +18191,7 @@
       <w:szCs w:val="24"/>
     </w:rPr>
   </w:style>
-  <w:style w:type="paragraph" w:styleId="Balk5">
+  <w:style w:type="paragraph" w:styleId="Heading5">
     <w:name w:val="heading 5"/>
     <w:basedOn w:val="Normal"/>
     <w:next w:val="Normal"/>
@@ -19076,7 +18209,7 @@
       <w:color w:val="666666"/>
     </w:rPr>
   </w:style>
-  <w:style w:type="paragraph" w:styleId="Balk6">
+  <w:style w:type="paragraph" w:styleId="Heading6">
     <w:name w:val="heading 6"/>
     <w:basedOn w:val="Normal"/>
     <w:next w:val="Normal"/>
@@ -19095,13 +18228,13 @@
       <w:color w:val="666666"/>
     </w:rPr>
   </w:style>
-  <w:style w:type="character" w:default="1" w:styleId="VarsaylanParagrafYazTipi">
+  <w:style w:type="character" w:default="1" w:styleId="DefaultParagraphFont">
     <w:name w:val="Default Paragraph Font"/>
     <w:uiPriority w:val="1"/>
     <w:semiHidden/>
     <w:unhideWhenUsed/>
   </w:style>
-  <w:style w:type="table" w:default="1" w:styleId="NormalTablo">
+  <w:style w:type="table" w:default="1" w:styleId="TableNormal">
     <w:name w:val="Normal Table"/>
     <w:uiPriority w:val="99"/>
     <w:semiHidden/>
@@ -19116,7 +18249,7 @@
       </w:tblCellMar>
     </w:tblPr>
   </w:style>
-  <w:style w:type="numbering" w:default="1" w:styleId="ListeYok">
+  <w:style w:type="numbering" w:default="1" w:styleId="NoList">
     <w:name w:val="No List"/>
     <w:uiPriority w:val="99"/>
     <w:semiHidden/>
@@ -19129,7 +18262,7 @@
       <w:rFonts w:ascii="OpenSymbol" w:eastAsia="OpenSymbol" w:hAnsi="OpenSymbol" w:cs="OpenSymbol"/>
     </w:rPr>
   </w:style>
-  <w:style w:type="character" w:styleId="Gl">
+  <w:style w:type="character" w:styleId="Strong">
     <w:name w:val="Strong"/>
     <w:qFormat/>
     <w:rPr>
@@ -19149,7 +18282,7 @@
       <w:color w:val="5983B0"/>
     </w:rPr>
   </w:style>
-  <w:style w:type="character" w:styleId="Vurgu">
+  <w:style w:type="character" w:styleId="Emphasis">
     <w:name w:val="Emphasis"/>
     <w:qFormat/>
     <w:rPr>
@@ -19160,7 +18293,7 @@
   <w:style w:type="paragraph" w:customStyle="1" w:styleId="Heading">
     <w:name w:val="Heading"/>
     <w:basedOn w:val="Normal"/>
-    <w:next w:val="GvdeMetni"/>
+    <w:next w:val="BodyText"/>
     <w:qFormat/>
     <w:pPr>
       <w:keepNext/>
@@ -19172,18 +18305,18 @@
       <w:szCs w:val="28"/>
     </w:rPr>
   </w:style>
-  <w:style w:type="paragraph" w:styleId="GvdeMetni">
+  <w:style w:type="paragraph" w:styleId="BodyText">
     <w:name w:val="Body Text"/>
     <w:basedOn w:val="Normal"/>
     <w:pPr>
       <w:spacing w:after="140"/>
     </w:pPr>
   </w:style>
-  <w:style w:type="paragraph" w:styleId="Liste">
+  <w:style w:type="paragraph" w:styleId="List">
     <w:name w:val="List"/>
-    <w:basedOn w:val="GvdeMetni"/>
+    <w:basedOn w:val="BodyText"/>
   </w:style>
-  <w:style w:type="paragraph" w:styleId="ResimYazs">
+  <w:style w:type="paragraph" w:styleId="Caption">
     <w:name w:val="caption"/>
     <w:basedOn w:val="Normal"/>
     <w:qFormat/>
@@ -19206,7 +18339,7 @@
       <w:suppressLineNumbers/>
     </w:pPr>
   </w:style>
-  <w:style w:type="paragraph" w:styleId="KonuBal">
+  <w:style w:type="paragraph" w:styleId="Title">
     <w:name w:val="Title"/>
     <w:basedOn w:val="Normal"/>
     <w:next w:val="Normal"/>
@@ -19236,7 +18369,7 @@
       <w:szCs w:val="24"/>
     </w:rPr>
   </w:style>
-  <w:style w:type="paragraph" w:styleId="ListeParagraf">
+  <w:style w:type="paragraph" w:styleId="ListParagraph">
     <w:name w:val="List Paragraph"/>
     <w:basedOn w:val="Normal"/>
     <w:uiPriority w:val="34"/>
@@ -19247,7 +18380,7 @@
       <w:contextualSpacing/>
     </w:pPr>
   </w:style>
-  <w:style w:type="paragraph" w:styleId="Altyaz">
+  <w:style w:type="paragraph" w:styleId="Subtitle">
     <w:name w:val="Subtitle"/>
     <w:basedOn w:val="Normal"/>
     <w:next w:val="Normal"/>
@@ -19276,11 +18409,11 @@
       </w:tabs>
     </w:pPr>
   </w:style>
-  <w:style w:type="paragraph" w:styleId="stBilgi">
+  <w:style w:type="paragraph" w:styleId="Header">
     <w:name w:val="header"/>
     <w:basedOn w:val="HeaderandFooter"/>
   </w:style>
-  <w:style w:type="table" w:customStyle="1" w:styleId="TableNormal">
+  <w:style w:type="table" w:customStyle="1" w:styleId="TableNormal0">
     <w:name w:val="TableNormal"/>
     <w:tblPr>
       <w:tblCellMar>
@@ -19291,7 +18424,7 @@
       </w:tblCellMar>
     </w:tblPr>
   </w:style>
-  <w:style w:type="table" w:customStyle="1" w:styleId="TableNormal0">
+  <w:style w:type="table" w:customStyle="1" w:styleId="TableNormal1">
     <w:name w:val="TableNormal"/>
     <w:tblPr>
       <w:tblCellMar>
@@ -19302,9 +18435,9 @@
       </w:tblCellMar>
     </w:tblPr>
   </w:style>
-  <w:style w:type="table" w:styleId="DzTablo1">
+  <w:style w:type="table" w:styleId="PlainTable1">
     <w:name w:val="Plain Table 1"/>
-    <w:basedOn w:val="NormalTablo"/>
+    <w:basedOn w:val="TableNormal"/>
     <w:uiPriority w:val="41"/>
     <w:rsid w:val="00AE221E"/>
     <w:tblPr>

</xml_diff>